<commit_message>
Completed arm movement according to stockfish. Haven't tested on real hardware yet
</commit_message>
<xml_diff>
--- a/KinematicsAndCoordinates/kinematcis_coordinates.docx
+++ b/KinematicsAndCoordinates/kinematcis_coordinates.docx
@@ -86,7 +86,7 @@
         <mc:AlternateContent>
           <mc:Choice Requires="wps">
             <w:drawing>
-              <wp:anchor behindDoc="0" distT="0" distB="0" distL="0" distR="0" simplePos="0" locked="0" layoutInCell="0" allowOverlap="1" relativeHeight="24">
+              <wp:anchor behindDoc="0" distT="635" distB="635" distL="635" distR="635" simplePos="0" locked="0" layoutInCell="0" allowOverlap="1" relativeHeight="12">
                 <wp:simplePos x="0" y="0"/>
                 <wp:positionH relativeFrom="column">
                   <wp:posOffset>3547110</wp:posOffset>
@@ -161,7 +161,7 @@
         <mc:AlternateContent>
           <mc:Choice Requires="wps">
             <w:drawing>
-              <wp:anchor behindDoc="0" distT="0" distB="0" distL="0" distR="0" simplePos="0" locked="0" layoutInCell="0" allowOverlap="1" relativeHeight="23">
+              <wp:anchor behindDoc="0" distT="635" distB="635" distL="635" distR="635" simplePos="0" locked="0" layoutInCell="0" allowOverlap="1" relativeHeight="11">
                 <wp:simplePos x="0" y="0"/>
                 <wp:positionH relativeFrom="column">
                   <wp:posOffset>2813685</wp:posOffset>
@@ -446,11 +446,7 @@
       </w:pPr>
       <w:r>
         <w:rPr/>
-        <w:t xml:space="preserve">φ₃ = θ₁ + θ₂ + θ₃  </w:t>
-      </w:r>
-      <w:r>
-        <w:rPr/>
-        <w:t>(1)</w:t>
+        <w:t>φ₃ = θ₁ + θ₂ + θ₃  (1)</w:t>
       </w:r>
     </w:p>
     <w:p>
@@ -490,11 +486,7 @@
       </w:pPr>
       <w:r>
         <w:rPr/>
-        <w:t xml:space="preserve">x = L₁ cos(θ₁) + L₂ cos(θ₁ + θ₂) + L₃ cos(θ₁ + θ₂ + θ₃) </w:t>
-      </w:r>
-      <w:r>
-        <w:rPr/>
-        <w:t>(2)</w:t>
+        <w:t>x = L₁ cos(θ₁) + L₂ cos(θ₁ + θ₂) + L₃ cos(θ₁ + θ₂ + θ₃) (2)</w:t>
       </w:r>
     </w:p>
     <w:p>
@@ -554,11 +546,7 @@
       </w:pPr>
       <w:r>
         <w:rPr/>
-        <w:t xml:space="preserve">y = L₁ sin(θ₁) + L₂ sin(θ₁ + θ₂) + L₃ sin(θ₁ + θ₂ + θ₃) </w:t>
-      </w:r>
-      <w:r>
-        <w:rPr/>
-        <w:t>(3)</w:t>
+        <w:t>y = L₁ sin(θ₁) + L₂ sin(θ₁ + θ₂) + L₃ sin(θ₁ + θ₂ + θ₃) (3)</w:t>
       </w:r>
     </w:p>
     <w:p>
@@ -589,6 +577,7 @@
     <w:p>
       <w:pPr>
         <w:pStyle w:val="Formula"/>
+        <w:jc w:val="center"/>
         <w:rPr/>
       </w:pPr>
       <w:r>
@@ -715,51 +704,7 @@
           <w:szCs w:val="22"/>
           <w:lang w:val="en-US" w:eastAsia="en-US" w:bidi="ar-SA"/>
         </w:rPr>
-        <w:t>x = L₁ cos(θ₁) + L₂ cos(θ₁ + θ₂) + L₃ cos(</w:t>
-      </w:r>
-      <w:r>
-        <w:rPr>
-          <w:rFonts w:eastAsia="Arial" w:cs="" w:ascii="Arial" w:hAnsi="Arial" w:cstheme="minorBidi"/>
-          <w:color w:val="auto"/>
-          <w:kern w:val="0"/>
-          <w:sz w:val="24"/>
-          <w:szCs w:val="22"/>
-          <w:lang w:val="en-US" w:eastAsia="en-US" w:bidi="ar-SA"/>
-        </w:rPr>
-        <w:t>φ</w:t>
-      </w:r>
-      <w:r>
-        <w:rPr>
-          <w:rFonts w:eastAsia="Arial" w:cs="" w:ascii="Arial" w:hAnsi="Arial" w:cstheme="minorBidi"/>
-          <w:color w:val="auto"/>
-          <w:kern w:val="0"/>
-          <w:sz w:val="24"/>
-          <w:szCs w:val="22"/>
-          <w:lang w:val="en-US" w:eastAsia="en-US" w:bidi="ar-SA"/>
-        </w:rPr>
-        <w:t>) (</w:t>
-      </w:r>
-      <w:r>
-        <w:rPr>
-          <w:rFonts w:eastAsia="Arial" w:cs="" w:ascii="Arial" w:hAnsi="Arial" w:cstheme="minorBidi"/>
-          <w:color w:val="auto"/>
-          <w:kern w:val="0"/>
-          <w:sz w:val="24"/>
-          <w:szCs w:val="22"/>
-          <w:lang w:val="en-US" w:eastAsia="en-US" w:bidi="ar-SA"/>
-        </w:rPr>
-        <w:t>4</w:t>
-      </w:r>
-      <w:r>
-        <w:rPr>
-          <w:rFonts w:eastAsia="Arial" w:cs="" w:ascii="Arial" w:hAnsi="Arial" w:cstheme="minorBidi"/>
-          <w:color w:val="auto"/>
-          <w:kern w:val="0"/>
-          <w:sz w:val="24"/>
-          <w:szCs w:val="22"/>
-          <w:lang w:val="en-US" w:eastAsia="en-US" w:bidi="ar-SA"/>
-        </w:rPr>
-        <w:t>)</w:t>
+        <w:t>x = L₁ cos(θ₁) + L₂ cos(θ₁ + θ₂) + L₃ cos(φ) (4)</w:t>
       </w:r>
     </w:p>
     <w:p>
@@ -795,40 +740,7 @@
           <w:szCs w:val="22"/>
           <w:lang w:val="en-US" w:eastAsia="en-US" w:bidi="ar-SA"/>
         </w:rPr>
-        <w:t xml:space="preserve">y = L₁ sin(θ₁) + L₂ sin(θ₁ + θ₂) + L₃ sin(φ) </w:t>
-      </w:r>
-      <w:r>
-        <w:rPr>
-          <w:rFonts w:eastAsia="Arial" w:cs="" w:ascii="Arial" w:hAnsi="Arial" w:cstheme="minorBidi"/>
-          <w:color w:val="auto"/>
-          <w:kern w:val="0"/>
-          <w:sz w:val="24"/>
-          <w:szCs w:val="22"/>
-          <w:lang w:val="en-US" w:eastAsia="en-US" w:bidi="ar-SA"/>
-        </w:rPr>
-        <w:t>(</w:t>
-      </w:r>
-      <w:r>
-        <w:rPr>
-          <w:rFonts w:eastAsia="Arial" w:cs="" w:ascii="Arial" w:hAnsi="Arial" w:cstheme="minorBidi"/>
-          <w:color w:val="auto"/>
-          <w:kern w:val="0"/>
-          <w:sz w:val="24"/>
-          <w:szCs w:val="22"/>
-          <w:lang w:val="en-US" w:eastAsia="en-US" w:bidi="ar-SA"/>
-        </w:rPr>
-        <w:t>5</w:t>
-      </w:r>
-      <w:r>
-        <w:rPr>
-          <w:rFonts w:eastAsia="Arial" w:cs="" w:ascii="Arial" w:hAnsi="Arial" w:cstheme="minorBidi"/>
-          <w:color w:val="auto"/>
-          <w:kern w:val="0"/>
-          <w:sz w:val="24"/>
-          <w:szCs w:val="22"/>
-          <w:lang w:val="en-US" w:eastAsia="en-US" w:bidi="ar-SA"/>
-        </w:rPr>
-        <w:t>)</w:t>
+        <w:t>y = L₁ sin(θ₁) + L₂ sin(θ₁ + θ₂) + L₃ sin(φ) (5)</w:t>
       </w:r>
     </w:p>
     <w:p>
@@ -845,7 +757,14 @@
         </w:rPr>
       </w:pPr>
       <w:r>
-        <w:rPr/>
+        <w:rPr>
+          <w:rFonts w:eastAsia="Arial" w:cs="" w:cstheme="minorBidi" w:ascii="Arial" w:hAnsi="Arial"/>
+          <w:color w:val="auto"/>
+          <w:kern w:val="0"/>
+          <w:sz w:val="24"/>
+          <w:szCs w:val="22"/>
+          <w:lang w:val="en-US" w:eastAsia="en-US" w:bidi="ar-SA"/>
+        </w:rPr>
       </w:r>
     </w:p>
     <w:p>
@@ -862,7 +781,14 @@
         </w:rPr>
       </w:pPr>
       <w:r>
-        <w:rPr/>
+        <w:rPr>
+          <w:rFonts w:eastAsia="Arial" w:cs="" w:cstheme="minorBidi"/>
+          <w:color w:val="auto"/>
+          <w:kern w:val="0"/>
+          <w:sz w:val="24"/>
+          <w:szCs w:val="22"/>
+          <w:lang w:val="en-US" w:eastAsia="en-US" w:bidi="ar-SA"/>
+        </w:rPr>
       </w:r>
     </w:p>
     <w:p>
@@ -883,73 +809,7 @@
           <w:szCs w:val="22"/>
           <w:lang w:val="en-US" w:eastAsia="en-US" w:bidi="ar-SA"/>
         </w:rPr>
-        <w:t>άν υψ</w:t>
-      </w:r>
-      <w:r>
-        <w:rPr>
-          <w:rFonts w:eastAsia="Arial" w:cs="" w:cstheme="minorBidi"/>
-          <w:color w:val="auto"/>
-          <w:kern w:val="0"/>
-          <w:sz w:val="24"/>
-          <w:szCs w:val="22"/>
-          <w:lang w:val="en-US" w:eastAsia="en-US" w:bidi="ar-SA"/>
-        </w:rPr>
-        <w:t>ωθούν</w:t>
-      </w:r>
-      <w:r>
-        <w:rPr>
-          <w:rFonts w:eastAsia="Arial" w:cs="" w:cstheme="minorBidi"/>
-          <w:color w:val="auto"/>
-          <w:kern w:val="0"/>
-          <w:sz w:val="24"/>
-          <w:szCs w:val="22"/>
-          <w:lang w:val="en-US" w:eastAsia="en-US" w:bidi="ar-SA"/>
-        </w:rPr>
-        <w:t xml:space="preserve"> στο τετράγωνο </w:t>
-      </w:r>
-      <w:r>
-        <w:rPr>
-          <w:rFonts w:eastAsia="Arial" w:cs="" w:cstheme="minorBidi"/>
-          <w:color w:val="auto"/>
-          <w:kern w:val="0"/>
-          <w:sz w:val="24"/>
-          <w:szCs w:val="22"/>
-          <w:lang w:val="en-US" w:eastAsia="en-US" w:bidi="ar-SA"/>
-        </w:rPr>
-        <w:t>οι</w:t>
-      </w:r>
-      <w:r>
-        <w:rPr>
-          <w:rFonts w:eastAsia="Arial" w:cs="" w:cstheme="minorBidi"/>
-          <w:color w:val="auto"/>
-          <w:kern w:val="0"/>
-          <w:sz w:val="24"/>
-          <w:szCs w:val="22"/>
-          <w:lang w:val="en-US" w:eastAsia="en-US" w:bidi="ar-SA"/>
-        </w:rPr>
-        <w:t xml:space="preserve"> εξισώσεις (4) και (5) και </w:t>
-      </w:r>
-      <w:r>
-        <w:rPr>
-          <w:rFonts w:eastAsia="Arial" w:cs="" w:cstheme="minorBidi"/>
-          <w:color w:val="auto"/>
-          <w:kern w:val="0"/>
-          <w:sz w:val="24"/>
-          <w:szCs w:val="22"/>
-          <w:lang w:val="en-US" w:eastAsia="en-US" w:bidi="ar-SA"/>
-        </w:rPr>
-        <w:t>στη συνέχεια προσθετούν κατά μέλη</w:t>
-      </w:r>
-      <w:r>
-        <w:rPr>
-          <w:rFonts w:eastAsia="Arial" w:cs="" w:cstheme="minorBidi"/>
-          <w:color w:val="auto"/>
-          <w:kern w:val="0"/>
-          <w:sz w:val="24"/>
-          <w:szCs w:val="22"/>
-          <w:lang w:val="en-US" w:eastAsia="en-US" w:bidi="ar-SA"/>
-        </w:rPr>
-        <w:t>, τότε προκύπτει:</w:t>
+        <w:t>άν υψωθούν στο τετράγωνο οι εξισώσεις (4) και (5) και στη συνέχεια προσθετούν κατά μέλη, τότε προκύπτει:</w:t>
       </w:r>
     </w:p>
     <w:p>
@@ -959,14 +819,7 @@
         <w:rPr/>
       </w:pPr>
       <w:r>
-        <w:rPr>
-          <w:rFonts w:eastAsia="Arial" w:cs="" w:cstheme="minorBidi"/>
-          <w:color w:val="auto"/>
-          <w:kern w:val="0"/>
-          <w:sz w:val="24"/>
-          <w:szCs w:val="22"/>
-          <w:lang w:val="en-US" w:eastAsia="en-US" w:bidi="ar-SA"/>
-        </w:rPr>
+        <w:rPr/>
       </w:r>
       <m:oMath xmlns:m="http://schemas.openxmlformats.org/officeDocument/2006/math">
         <m:r>
@@ -1308,29 +1161,7 @@
           <w:szCs w:val="22"/>
           <w:lang w:val="en-US" w:eastAsia="en-US" w:bidi="ar-SA"/>
         </w:rPr>
-        <w:t xml:space="preserve">ότητα, </w:t>
-      </w:r>
-      <w:r>
-        <w:rPr>
-          <w:rFonts w:eastAsia="Arial" w:cs="" w:cstheme="minorBidi"/>
-          <w:color w:val="auto"/>
-          <w:kern w:val="0"/>
-          <w:sz w:val="24"/>
-          <w:szCs w:val="22"/>
-          <w:lang w:val="en-US" w:eastAsia="en-US" w:bidi="ar-SA"/>
-        </w:rPr>
-        <w:t>θέτουμε</w:t>
-      </w:r>
-      <w:r>
-        <w:rPr>
-          <w:rFonts w:eastAsia="Arial" w:cs="" w:cstheme="minorBidi"/>
-          <w:color w:val="auto"/>
-          <w:kern w:val="0"/>
-          <w:sz w:val="24"/>
-          <w:szCs w:val="22"/>
-          <w:lang w:val="en-US" w:eastAsia="en-US" w:bidi="ar-SA"/>
-        </w:rPr>
-        <w:t xml:space="preserve"> cos(θ</w:t>
+        <w:t>ότητα, θέτουμε cos(θ</w:t>
       </w:r>
       <w:r>
         <w:rPr>
@@ -1444,17 +1275,7 @@
         <w:rPr/>
       </w:pPr>
       <w:r>
-        <w:rPr>
-          <w:rFonts w:eastAsia="Arial" w:cs="" w:cstheme="minorBidi"/>
-          <w:color w:val="auto"/>
-          <w:kern w:val="0"/>
-          <w:position w:val="0"/>
-          <w:sz w:val="24"/>
-          <w:sz w:val="24"/>
-          <w:szCs w:val="22"/>
-          <w:vertAlign w:val="baseline"/>
-          <w:lang w:val="en-US" w:eastAsia="en-US" w:bidi="ar-SA"/>
-        </w:rPr>
+        <w:rPr/>
       </w:r>
       <m:oMathPara xmlns:m="http://schemas.openxmlformats.org/officeDocument/2006/math">
         <m:oMathParaPr>
@@ -1504,16 +1325,10 @@
             <m:t xml:space="preserve">1</m:t>
           </m:r>
           <m:r>
-            <m:t xml:space="preserve"> </m:t>
-          </m:r>
-          <m:r>
             <w:rPr>
               <w:rFonts w:ascii="Cambria Math" w:hAnsi="Cambria Math"/>
             </w:rPr>
             <m:t xml:space="preserve">∧</m:t>
-          </m:r>
-          <m:r>
-            <m:t xml:space="preserve"> </m:t>
           </m:r>
           <m:r>
             <w:rPr>
@@ -1586,7 +1401,17 @@
         </w:rPr>
       </w:pPr>
       <w:r>
-        <w:rPr/>
+        <w:rPr>
+          <w:rFonts w:eastAsia="Arial" w:cs="" w:cstheme="minorBidi"/>
+          <w:color w:val="auto"/>
+          <w:kern w:val="0"/>
+          <w:position w:val="0"/>
+          <w:sz w:val="24"/>
+          <w:sz w:val="24"/>
+          <w:szCs w:val="22"/>
+          <w:vertAlign w:val="baseline"/>
+          <w:lang w:val="en-US" w:eastAsia="en-US" w:bidi="ar-SA"/>
+        </w:rPr>
       </w:r>
     </w:p>
     <w:p>
@@ -1607,48 +1432,10 @@
           <w:vertAlign w:val="baseline"/>
           <w:lang w:val="en-US" w:eastAsia="en-US" w:bidi="ar-SA"/>
         </w:rPr>
-        <w:t>Είναι γνωστό</w:t>
+        <w:t xml:space="preserve">Είναι γνωστό από την Πυθαγόρεια ταυτότητα πως ισχύει: </w:t>
       </w:r>
       <w:r>
-        <w:rPr>
-          <w:rFonts w:eastAsia="Arial" w:cs="" w:cstheme="minorBidi"/>
-          <w:color w:val="auto"/>
-          <w:kern w:val="0"/>
-          <w:position w:val="0"/>
-          <w:sz w:val="24"/>
-          <w:sz w:val="24"/>
-          <w:szCs w:val="22"/>
-          <w:vertAlign w:val="baseline"/>
-          <w:lang w:val="en-US" w:eastAsia="en-US" w:bidi="ar-SA"/>
-        </w:rPr>
-        <w:t xml:space="preserve"> από την </w:t>
-      </w:r>
-      <w:r>
-        <w:rPr>
-          <w:rFonts w:eastAsia="Arial" w:cs="" w:cstheme="minorBidi"/>
-          <w:color w:val="auto"/>
-          <w:kern w:val="0"/>
-          <w:position w:val="0"/>
-          <w:sz w:val="24"/>
-          <w:sz w:val="24"/>
-          <w:szCs w:val="22"/>
-          <w:vertAlign w:val="baseline"/>
-          <w:lang w:val="en-US" w:eastAsia="en-US" w:bidi="ar-SA"/>
-        </w:rPr>
-        <w:t xml:space="preserve">Πυθαγόρεια ταυτότητα πως ισχύει: </w:t>
-      </w:r>
-      <w:r>
-        <w:rPr>
-          <w:rFonts w:eastAsia="Arial" w:cs="" w:cstheme="minorBidi"/>
-          <w:color w:val="auto"/>
-          <w:kern w:val="0"/>
-          <w:position w:val="0"/>
-          <w:sz w:val="24"/>
-          <w:sz w:val="24"/>
-          <w:szCs w:val="22"/>
-          <w:vertAlign w:val="baseline"/>
-          <w:lang w:val="en-US" w:eastAsia="en-US" w:bidi="ar-SA"/>
-        </w:rPr>
+        <w:rPr/>
       </w:r>
       <m:oMath xmlns:m="http://schemas.openxmlformats.org/officeDocument/2006/math">
         <m:r>
@@ -1718,16 +1505,10 @@
           <m:t xml:space="preserve">1</m:t>
         </m:r>
         <m:r>
-          <m:t xml:space="preserve"> </m:t>
-        </m:r>
-        <m:r>
           <w:rPr>
             <w:rFonts w:ascii="Cambria Math" w:hAnsi="Cambria Math"/>
           </w:rPr>
           <m:t xml:space="preserve">⇒</m:t>
-        </m:r>
-        <m:r>
-          <m:t xml:space="preserve"> </m:t>
         </m:r>
         <m:r>
           <w:rPr>
@@ -1913,17 +1694,7 @@
         <w:rPr/>
       </w:pPr>
       <w:r>
-        <w:rPr>
-          <w:rFonts w:eastAsia="Arial" w:cs="" w:cstheme="minorBidi"/>
-          <w:color w:val="auto"/>
-          <w:kern w:val="0"/>
-          <w:position w:val="0"/>
-          <w:sz w:val="24"/>
-          <w:sz w:val="24"/>
-          <w:szCs w:val="22"/>
-          <w:vertAlign w:val="baseline"/>
-          <w:lang w:val="en-US" w:eastAsia="en-US" w:bidi="ar-SA"/>
-        </w:rPr>
+        <w:rPr/>
       </w:r>
       <m:oMath xmlns:m="http://schemas.openxmlformats.org/officeDocument/2006/math">
         <m:sSub>
@@ -2013,21 +1784,7 @@
           <w:vertAlign w:val="baseline"/>
           <w:lang w:val="en-US" w:eastAsia="en-US" w:bidi="ar-SA"/>
         </w:rPr>
-        <w:t>(</w:t>
-      </w:r>
-      <w:r>
-        <w:rPr>
-          <w:rFonts w:eastAsia="Arial" w:cs="" w:cstheme="minorBidi"/>
-          <w:color w:val="auto"/>
-          <w:kern w:val="0"/>
-          <w:position w:val="0"/>
-          <w:sz w:val="24"/>
-          <w:sz w:val="24"/>
-          <w:szCs w:val="22"/>
-          <w:vertAlign w:val="baseline"/>
-          <w:lang w:val="en-US" w:eastAsia="en-US" w:bidi="ar-SA"/>
-        </w:rPr>
-        <w:t>7)</w:t>
+        <w:t>(7)</w:t>
       </w:r>
     </w:p>
     <w:p>
@@ -2036,7 +1793,9 @@
         <w:jc w:val="right"/>
         <w:rPr/>
       </w:pPr>
-      <w:r/>
+      <w:r>
+        <w:rPr/>
+      </w:r>
       <m:oMath xmlns:m="http://schemas.openxmlformats.org/officeDocument/2006/math">
         <m:sSub>
           <m:e>
@@ -2757,21 +2516,7 @@
           <w:vertAlign w:val="baseline"/>
           <w:lang w:val="en-US" w:eastAsia="en-US" w:bidi="ar-SA"/>
         </w:rPr>
-        <w:t>(</w:t>
-      </w:r>
-      <w:r>
-        <w:rPr>
-          <w:rFonts w:eastAsia="Arial" w:cs="" w:cstheme="minorBidi"/>
-          <w:color w:val="auto"/>
-          <w:kern w:val="0"/>
-          <w:position w:val="0"/>
-          <w:sz w:val="24"/>
-          <w:sz w:val="24"/>
-          <w:szCs w:val="22"/>
-          <w:vertAlign w:val="baseline"/>
-          <w:lang w:val="en-US" w:eastAsia="en-US" w:bidi="ar-SA"/>
-        </w:rPr>
-        <w:t>8)</w:t>
+        <w:t>(8)</w:t>
       </w:r>
     </w:p>
     <w:p>
@@ -2781,17 +2526,7 @@
         <w:rPr/>
       </w:pPr>
       <w:r>
-        <w:rPr>
-          <w:rFonts w:eastAsia="Arial" w:cs="" w:cstheme="minorBidi"/>
-          <w:color w:val="auto"/>
-          <w:kern w:val="0"/>
-          <w:position w:val="0"/>
-          <w:sz w:val="24"/>
-          <w:sz w:val="24"/>
-          <w:szCs w:val="22"/>
-          <w:vertAlign w:val="baseline"/>
-          <w:lang w:val="en-US" w:eastAsia="en-US" w:bidi="ar-SA"/>
-        </w:rPr>
+        <w:rPr/>
       </w:r>
       <m:oMath xmlns:m="http://schemas.openxmlformats.org/officeDocument/2006/math">
         <m:sSub>
@@ -2924,8 +2659,21 @@
           <w:szCs w:val="22"/>
           <w:lang w:val="en-US" w:eastAsia="en-US" w:bidi="ar-SA"/>
         </w:rPr>
-        <w:t>ό</w:t>
+        <w:t>όπου η συνάρτηση atan2 χρησιμοποιείται αντί της απλής atan, διότι η atan2 επιστρέφει πάντα μονοσήμαντα αποτελέσματα, ανάλογα σε ποιο τεταρτημόριο βρίσκεται η γωνία.</w:t>
       </w:r>
+    </w:p>
+    <w:p>
+      <w:pPr>
+        <w:pStyle w:val="Normal"/>
+        <w:rPr>
+          <w:rFonts w:ascii="Arial" w:hAnsi="Arial" w:eastAsia="Arial" w:cs="" w:cstheme="minorBidi"/>
+          <w:color w:val="auto"/>
+          <w:kern w:val="0"/>
+          <w:sz w:val="24"/>
+          <w:szCs w:val="22"/>
+          <w:lang w:val="en-US" w:eastAsia="en-US" w:bidi="ar-SA"/>
+        </w:rPr>
+      </w:pPr>
       <w:r>
         <w:rPr>
           <w:rFonts w:eastAsia="Arial" w:cs="" w:cstheme="minorBidi"/>
@@ -2935,23 +2683,6 @@
           <w:szCs w:val="22"/>
           <w:lang w:val="en-US" w:eastAsia="en-US" w:bidi="ar-SA"/>
         </w:rPr>
-        <w:t>που η συνάρτηση atan2 χρησιμοποιείται αντί της απλής atan, διότι η atan2 επιστρέφει πάντα μονοσήμαντα αποτελέσματα, ανάλογα σε ποιο τεταρτημόριο βρίσκεται η γωνία.</w:t>
-      </w:r>
-    </w:p>
-    <w:p>
-      <w:pPr>
-        <w:pStyle w:val="Normal"/>
-        <w:rPr>
-          <w:rFonts w:ascii="Arial" w:hAnsi="Arial" w:eastAsia="Arial" w:cs="" w:cstheme="minorBidi"/>
-          <w:color w:val="auto"/>
-          <w:kern w:val="0"/>
-          <w:sz w:val="24"/>
-          <w:szCs w:val="22"/>
-          <w:lang w:val="en-US" w:eastAsia="en-US" w:bidi="ar-SA"/>
-        </w:rPr>
-      </w:pPr>
-      <w:r>
-        <w:rPr/>
       </w:r>
     </w:p>
     <w:p>
@@ -3005,14 +2736,7 @@
         <w:rPr/>
       </w:pPr>
       <w:r>
-        <w:rPr>
-          <w:rFonts w:eastAsia="Arial" w:cs="" w:cstheme="minorBidi"/>
-          <w:color w:val="auto"/>
-          <w:kern w:val="0"/>
-          <w:sz w:val="24"/>
-          <w:szCs w:val="22"/>
-          <w:lang w:val="en-US" w:eastAsia="en-US" w:bidi="ar-SA"/>
-        </w:rPr>
+        <w:rPr/>
       </w:r>
       <m:oMathPara xmlns:m="http://schemas.openxmlformats.org/officeDocument/2006/math">
         <m:oMathParaPr>
@@ -3044,16 +2768,10 @@
             <m:t xml:space="preserve">B</m:t>
           </m:r>
           <m:r>
-            <m:t xml:space="preserve"> </m:t>
-          </m:r>
-          <m:r>
             <w:rPr>
               <w:rFonts w:ascii="Cambria Math" w:hAnsi="Cambria Math"/>
             </w:rPr>
             <m:t xml:space="preserve">∈</m:t>
-          </m:r>
-          <m:r>
-            <m:t xml:space="preserve"> </m:t>
           </m:r>
           <m:r>
             <w:rPr>
@@ -3066,9 +2784,6 @@
               <w:rFonts w:ascii="Cambria Math" w:hAnsi="Cambria Math"/>
             </w:rPr>
             <m:t xml:space="preserve">:</m:t>
-          </m:r>
-          <m:r>
-            <m:t xml:space="preserve"> </m:t>
           </m:r>
           <m:r>
             <w:rPr>
@@ -3224,18 +2939,7 @@
           <w:szCs w:val="22"/>
           <w:lang w:val="en-US" w:eastAsia="en-US" w:bidi="ar-SA"/>
         </w:rPr>
-        <w:t xml:space="preserve">Επομένως, η </w:t>
-      </w:r>
-      <w:r>
-        <w:rPr>
-          <w:rFonts w:eastAsia="Arial" w:cs="" w:cstheme="minorBidi"/>
-          <w:color w:val="auto"/>
-          <w:kern w:val="0"/>
-          <w:sz w:val="24"/>
-          <w:szCs w:val="22"/>
-          <w:lang w:val="en-US" w:eastAsia="en-US" w:bidi="ar-SA"/>
-        </w:rPr>
-        <w:t>εξίσωση (8) μετατρέπεται</w:t>
+        <w:t>Επομένως, η εξίσωση (8) μετατρέπεται</w:t>
       </w:r>
       <w:r>
         <w:rPr>
@@ -3249,35 +2953,7 @@
           <w:vertAlign w:val="baseline"/>
           <w:lang w:val="en-US" w:eastAsia="en-US" w:bidi="ar-SA"/>
         </w:rPr>
-        <w:t xml:space="preserve"> </w:t>
-      </w:r>
-      <w:r>
-        <w:rPr>
-          <w:rFonts w:eastAsia="Arial" w:cs="" w:cstheme="minorBidi"/>
-          <w:color w:val="auto"/>
-          <w:kern w:val="0"/>
-          <w:position w:val="0"/>
-          <w:sz w:val="24"/>
-          <w:sz w:val="24"/>
-          <w:szCs w:val="22"/>
-          <w:vertAlign w:val="baseline"/>
-          <w:lang w:val="en-US" w:eastAsia="en-US" w:bidi="ar-SA"/>
-        </w:rPr>
-        <w:t>σ</w:t>
-      </w:r>
-      <w:r>
-        <w:rPr>
-          <w:rFonts w:eastAsia="Arial" w:cs="" w:cstheme="minorBidi"/>
-          <w:color w:val="auto"/>
-          <w:kern w:val="0"/>
-          <w:position w:val="0"/>
-          <w:sz w:val="24"/>
-          <w:sz w:val="24"/>
-          <w:szCs w:val="22"/>
-          <w:vertAlign w:val="baseline"/>
-          <w:lang w:val="en-US" w:eastAsia="en-US" w:bidi="ar-SA"/>
-        </w:rPr>
-        <w:t>ε:</w:t>
+        <w:t xml:space="preserve"> σε:</w:t>
       </w:r>
     </w:p>
     <w:p>
@@ -3289,7 +2965,9 @@
         </w:numPr>
         <w:rPr/>
       </w:pPr>
-      <w:r/>
+      <w:r>
+        <w:rPr/>
+      </w:r>
       <m:oMath xmlns:m="http://schemas.openxmlformats.org/officeDocument/2006/math">
         <m:sSub>
           <m:e>
@@ -3795,29 +3473,7 @@
           <w:szCs w:val="22"/>
           <w:lang w:val="en-US" w:eastAsia="en-US" w:bidi="ar-SA"/>
         </w:rPr>
-        <w:t xml:space="preserve">έση του “αγκώνα” του βραχίονα ορίζεται από το πρόσημο του S2. </w:t>
-      </w:r>
-      <w:r>
-        <w:rPr>
-          <w:rFonts w:eastAsia="Arial" w:cs="" w:cstheme="minorBidi"/>
-          <w:color w:val="auto"/>
-          <w:kern w:val="0"/>
-          <w:sz w:val="24"/>
-          <w:szCs w:val="22"/>
-          <w:lang w:val="en-US" w:eastAsia="en-US" w:bidi="ar-SA"/>
-        </w:rPr>
-        <w:t>Επιστρέφονται δύο διαφορετικές λύσεις,όπου η μία τίθει τον αγκώνα προς τα πάνω</w:t>
-      </w:r>
-      <w:r>
-        <w:rPr>
-          <w:rFonts w:eastAsia="Arial" w:cs="" w:cstheme="minorBidi"/>
-          <w:color w:val="auto"/>
-          <w:kern w:val="0"/>
-          <w:sz w:val="24"/>
-          <w:szCs w:val="22"/>
-          <w:lang w:val="en-US" w:eastAsia="en-US" w:bidi="ar-SA"/>
-        </w:rPr>
-        <w:t>(elbow-up) και η άλλη τίθει τον αγκώνα προς τα κάτω(elbow-down). Σε αυτόν τον βραχίονα, απαιτείται η elbow-up λύση, η οποία δίνεται από το αρνητικό πρόσημο.</w:t>
+        <w:t>έση του “αγκώνα” του βραχίονα ορίζεται από το πρόσημο του S2. Επιστρέφονται δύο διαφορετικές λύσεις,όπου η μία τίθει τον αγκώνα προς τα πάνω(elbow-up) και η άλλη τίθει τον αγκώνα προς τα κάτω(elbow-down). Σε αυτόν τον βραχίονα, απαιτείται η elbow-up λύση, η οποία δίνεται από το αρνητικό πρόσημο.</w:t>
       </w:r>
     </w:p>
     <w:p>
@@ -3838,7 +3494,14 @@
         </w:rPr>
       </w:pPr>
       <w:r>
-        <w:rPr/>
+        <w:rPr>
+          <w:rFonts w:eastAsia="Arial" w:cs="" w:cstheme="minorBidi"/>
+          <w:color w:val="auto"/>
+          <w:kern w:val="0"/>
+          <w:sz w:val="24"/>
+          <w:szCs w:val="22"/>
+          <w:lang w:val="en-US" w:eastAsia="en-US" w:bidi="ar-SA"/>
+        </w:rPr>
       </w:r>
     </w:p>
     <w:p>
@@ -3860,40 +3523,7 @@
           <w:szCs w:val="22"/>
           <w:lang w:val="en-US" w:eastAsia="en-US" w:bidi="ar-SA"/>
         </w:rPr>
-        <w:t xml:space="preserve">Στην πραγματικότητα, οι γωνίες θ που υπολογίζονται δεν ταυτίζονται με τις γωνίες </w:t>
-      </w:r>
-      <w:r>
-        <w:rPr>
-          <w:rFonts w:eastAsia="Arial" w:cs="" w:cstheme="minorBidi"/>
-          <w:color w:val="auto"/>
-          <w:kern w:val="0"/>
-          <w:sz w:val="24"/>
-          <w:szCs w:val="22"/>
-          <w:lang w:val="en-US" w:eastAsia="en-US" w:bidi="ar-SA"/>
-        </w:rPr>
-        <w:t>των</w:t>
-      </w:r>
-      <w:r>
-        <w:rPr>
-          <w:rFonts w:eastAsia="Arial" w:cs="" w:cstheme="minorBidi"/>
-          <w:color w:val="auto"/>
-          <w:kern w:val="0"/>
-          <w:sz w:val="24"/>
-          <w:szCs w:val="22"/>
-          <w:lang w:val="en-US" w:eastAsia="en-US" w:bidi="ar-SA"/>
-        </w:rPr>
-        <w:t xml:space="preserve"> servo που πρέπει να δωθούν. Αυτό συμβαίνει, επειδή στην συναρμολόγιση του βραχίονα, </w:t>
-      </w:r>
-      <w:r>
-        <w:rPr>
-          <w:rFonts w:eastAsia="Arial" w:cs="" w:cstheme="minorBidi"/>
-          <w:color w:val="auto"/>
-          <w:kern w:val="0"/>
-          <w:sz w:val="24"/>
-          <w:szCs w:val="22"/>
-          <w:lang w:val="en-US" w:eastAsia="en-US" w:bidi="ar-SA"/>
-        </w:rPr>
-        <w:t xml:space="preserve">οι άξονες δεν έχουν τοποθετηθεί μηχανικά στον σημείο αναφοράς του μαθηματικού μοντέλου. Επομένως, απαιτείται </w:t>
+        <w:t xml:space="preserve">Στην πραγματικότητα, οι γωνίες θ που υπολογίζονται δεν ταυτίζονται με τις γωνίες των servo που πρέπει να δωθούν. Αυτό συμβαίνει, επειδή στην συναρμολόγιση του βραχίονα, οι άξονες δεν έχουν τοποθετηθεί μηχανικά στον σημείο αναφοράς του μαθηματικού μοντέλου. Επομένως, απαιτείται </w:t>
       </w:r>
       <w:r>
         <w:rPr>
@@ -3956,6 +3586,7 @@
           <w:p>
             <w:pPr>
               <w:pStyle w:val="TableContents"/>
+              <w:widowControl w:val="false"/>
               <w:spacing w:before="0" w:after="200"/>
               <w:jc w:val="center"/>
               <w:rPr/>
@@ -3973,6 +3604,7 @@
           <w:p>
             <w:pPr>
               <w:pStyle w:val="TableContents"/>
+              <w:widowControl w:val="false"/>
               <w:spacing w:before="0" w:after="200"/>
               <w:jc w:val="center"/>
               <w:rPr/>
@@ -3997,6 +3629,7 @@
           <w:p>
             <w:pPr>
               <w:pStyle w:val="TableContents"/>
+              <w:widowControl w:val="false"/>
               <w:spacing w:before="0" w:after="200"/>
               <w:jc w:val="center"/>
               <w:rPr/>
@@ -4024,6 +3657,7 @@
           <w:p>
             <w:pPr>
               <w:pStyle w:val="TableContents"/>
+              <w:widowControl w:val="false"/>
               <w:spacing w:before="0" w:after="200"/>
               <w:jc w:val="center"/>
               <w:rPr/>
@@ -4048,6 +3682,7 @@
           <w:p>
             <w:pPr>
               <w:pStyle w:val="TableContents"/>
+              <w:widowControl w:val="false"/>
               <w:spacing w:before="0" w:after="200"/>
               <w:jc w:val="center"/>
               <w:rPr/>
@@ -4066,6 +3701,7 @@
           <w:p>
             <w:pPr>
               <w:pStyle w:val="TableContents"/>
+              <w:widowControl w:val="false"/>
               <w:spacing w:before="0" w:after="200"/>
               <w:jc w:val="center"/>
               <w:rPr/>
@@ -4087,6 +3723,7 @@
           <w:p>
             <w:pPr>
               <w:pStyle w:val="TableContents"/>
+              <w:widowControl w:val="false"/>
               <w:spacing w:before="0" w:after="200"/>
               <w:jc w:val="center"/>
               <w:rPr/>
@@ -4111,6 +3748,7 @@
           <w:p>
             <w:pPr>
               <w:pStyle w:val="TableContents"/>
+              <w:widowControl w:val="false"/>
               <w:spacing w:before="0" w:after="200"/>
               <w:jc w:val="center"/>
               <w:rPr/>
@@ -4129,6 +3767,7 @@
           <w:p>
             <w:pPr>
               <w:pStyle w:val="TableContents"/>
+              <w:widowControl w:val="false"/>
               <w:spacing w:before="0" w:after="200"/>
               <w:jc w:val="center"/>
               <w:rPr/>
@@ -4150,6 +3789,7 @@
           <w:p>
             <w:pPr>
               <w:pStyle w:val="TableContents"/>
+              <w:widowControl w:val="false"/>
               <w:spacing w:before="0" w:after="200"/>
               <w:jc w:val="center"/>
               <w:rPr/>
@@ -4174,6 +3814,7 @@
           <w:p>
             <w:pPr>
               <w:pStyle w:val="TableContents"/>
+              <w:widowControl w:val="false"/>
               <w:spacing w:before="0" w:after="200"/>
               <w:jc w:val="center"/>
               <w:rPr/>
@@ -4192,6 +3833,7 @@
           <w:p>
             <w:pPr>
               <w:pStyle w:val="TableContents"/>
+              <w:widowControl w:val="false"/>
               <w:spacing w:before="0" w:after="200"/>
               <w:jc w:val="center"/>
               <w:rPr/>
@@ -4230,7 +3872,19 @@
         </w:rPr>
       </w:pPr>
       <w:r>
-        <w:rPr/>
+        <w:rPr>
+          <w:rFonts w:eastAsia="Arial" w:cs="" w:cstheme="minorBidi"/>
+          <w:b w:val="false"/>
+          <w:bCs w:val="false"/>
+          <w:i w:val="false"/>
+          <w:iCs w:val="false"/>
+          <w:color w:val="auto"/>
+          <w:kern w:val="0"/>
+          <w:sz w:val="24"/>
+          <w:szCs w:val="22"/>
+          <w:u w:val="none"/>
+          <w:lang w:val="en-US" w:eastAsia="en-US" w:bidi="ar-SA"/>
+        </w:rPr>
       </w:r>
     </w:p>
     <w:p>
@@ -4292,17 +3946,7 @@
         <w:rPr/>
       </w:pPr>
       <w:r>
-        <w:rPr>
-          <w:rFonts w:eastAsia="Arial" w:cs="" w:cstheme="minorBidi"/>
-          <w:color w:val="auto"/>
-          <w:kern w:val="0"/>
-          <w:position w:val="0"/>
-          <w:sz w:val="24"/>
-          <w:sz w:val="24"/>
-          <w:szCs w:val="22"/>
-          <w:vertAlign w:val="baseline"/>
-          <w:lang w:val="en-US" w:eastAsia="en-US" w:bidi="ar-SA"/>
-        </w:rPr>
+        <w:rPr/>
       </w:r>
       <m:oMathPara xmlns:m="http://schemas.openxmlformats.org/officeDocument/2006/math">
         <m:oMathParaPr>
@@ -4533,7 +4177,7 @@
                         <wps:spPr>
                           <a:xfrm>
                             <a:off x="0" y="2784600"/>
-                            <a:ext cx="6858000" cy="0"/>
+                            <a:ext cx="6858000" cy="720"/>
                           </a:xfrm>
                           <a:prstGeom prst="line">
                             <a:avLst/>
@@ -4557,7 +4201,7 @@
                         <wps:spPr>
                           <a:xfrm>
                             <a:off x="3000960" y="2862720"/>
-                            <a:ext cx="566280" cy="315720"/>
+                            <a:ext cx="565920" cy="315000"/>
                           </a:xfrm>
                           <a:prstGeom prst="ellipse">
                             <a:avLst/>
@@ -4584,7 +4228,7 @@
                         <wps:spPr>
                           <a:xfrm>
                             <a:off x="857160" y="795600"/>
-                            <a:ext cx="713160" cy="315720"/>
+                            <a:ext cx="712440" cy="315000"/>
                           </a:xfrm>
                           <a:prstGeom prst="rect">
                             <a:avLst/>
@@ -4611,7 +4255,7 @@
                         <wps:spPr>
                           <a:xfrm>
                             <a:off x="4714920" y="1432440"/>
-                            <a:ext cx="710640" cy="315000"/>
+                            <a:ext cx="709920" cy="314280"/>
                           </a:xfrm>
                           <a:prstGeom prst="rect">
                             <a:avLst/>
@@ -4715,7 +4359,7 @@
                         <wps:spPr>
                           <a:xfrm>
                             <a:off x="2903760" y="2486160"/>
-                            <a:ext cx="424080" cy="147960"/>
+                            <a:ext cx="423720" cy="147240"/>
                           </a:xfrm>
                           <a:custGeom>
                             <a:avLst/>
@@ -4755,7 +4399,7 @@
                         <wps:spPr>
                           <a:xfrm>
                             <a:off x="3295800" y="2583720"/>
-                            <a:ext cx="508680" cy="128880"/>
+                            <a:ext cx="507960" cy="128160"/>
                           </a:xfrm>
                           <a:custGeom>
                             <a:avLst/>
@@ -4852,7 +4496,7 @@
                         <wps:spPr>
                           <a:xfrm>
                             <a:off x="2858040" y="2306160"/>
-                            <a:ext cx="138960" cy="546840"/>
+                            <a:ext cx="138600" cy="546120"/>
                           </a:xfrm>
                           <a:prstGeom prst="rect">
                             <a:avLst/>
@@ -4902,7 +4546,7 @@
                             </w:p>
                           </w:txbxContent>
                         </wps:txbx>
-                        <wps:bodyPr lIns="90000" rIns="90000" tIns="674640" bIns="674640" anchor="t">
+                        <wps:bodyPr lIns="90000" rIns="90000" tIns="547200" bIns="547200" anchor="t">
                           <a:noAutofit/>
                         </wps:bodyPr>
                       </wps:wsp>
@@ -4911,7 +4555,7 @@
                         <wps:spPr>
                           <a:xfrm>
                             <a:off x="3432960" y="2306160"/>
-                            <a:ext cx="272520" cy="546840"/>
+                            <a:ext cx="271800" cy="546120"/>
                           </a:xfrm>
                           <a:prstGeom prst="rect">
                             <a:avLst/>
@@ -4961,7 +4605,7 @@
                             </w:p>
                           </w:txbxContent>
                         </wps:txbx>
-                        <wps:bodyPr lIns="90000" rIns="90000" tIns="674640" bIns="674640" anchor="t">
+                        <wps:bodyPr lIns="90000" rIns="90000" tIns="547200" bIns="547200" anchor="t">
                           <a:noAutofit/>
                         </wps:bodyPr>
                       </wps:wsp>
@@ -4970,7 +4614,7 @@
                         <wps:spPr>
                           <a:xfrm>
                             <a:off x="3432960" y="1989000"/>
-                            <a:ext cx="272520" cy="545400"/>
+                            <a:ext cx="271800" cy="544680"/>
                           </a:xfrm>
                           <a:prstGeom prst="rect">
                             <a:avLst/>
@@ -5020,7 +4664,7 @@
                             </w:p>
                           </w:txbxContent>
                         </wps:txbx>
-                        <wps:bodyPr lIns="90000" rIns="90000" tIns="674640" bIns="674640" anchor="t">
+                        <wps:bodyPr lIns="90000" rIns="90000" tIns="545760" bIns="545760" anchor="t">
                           <a:noAutofit/>
                         </wps:bodyPr>
                       </wps:wsp>
@@ -5029,7 +4673,7 @@
                         <wps:spPr>
                           <a:xfrm>
                             <a:off x="3999960" y="1351800"/>
-                            <a:ext cx="284400" cy="544680"/>
+                            <a:ext cx="283680" cy="544320"/>
                           </a:xfrm>
                           <a:prstGeom prst="rect">
                             <a:avLst/>
@@ -5079,7 +4723,7 @@
                             </w:p>
                           </w:txbxContent>
                         </wps:txbx>
-                        <wps:bodyPr lIns="90000" rIns="90000" tIns="674640" bIns="674640" anchor="t">
+                        <wps:bodyPr lIns="90000" rIns="90000" tIns="545040" bIns="545040" anchor="t">
                           <a:noAutofit/>
                         </wps:bodyPr>
                       </wps:wsp>
@@ -5117,7 +4761,7 @@
                         <wps:spPr>
                           <a:xfrm>
                             <a:off x="857160" y="1670040"/>
-                            <a:ext cx="424080" cy="544680"/>
+                            <a:ext cx="423720" cy="544320"/>
                           </a:xfrm>
                           <a:prstGeom prst="rect">
                             <a:avLst/>
@@ -5167,7 +4811,7 @@
                             </w:p>
                           </w:txbxContent>
                         </wps:txbx>
-                        <wps:bodyPr lIns="90000" rIns="90000" tIns="674640" bIns="674640" anchor="t">
+                        <wps:bodyPr lIns="90000" rIns="90000" tIns="545040" bIns="545040" anchor="t">
                           <a:noAutofit/>
                         </wps:bodyPr>
                       </wps:wsp>
@@ -5176,7 +4820,7 @@
                         <wps:spPr>
                           <a:xfrm>
                             <a:off x="2286000" y="714960"/>
-                            <a:ext cx="280800" cy="546120"/>
+                            <a:ext cx="280080" cy="545400"/>
                           </a:xfrm>
                           <a:prstGeom prst="rect">
                             <a:avLst/>
@@ -5226,7 +4870,7 @@
                             </w:p>
                           </w:txbxContent>
                         </wps:txbx>
-                        <wps:bodyPr lIns="90000" rIns="90000" tIns="674640" bIns="674640" anchor="t">
+                        <wps:bodyPr lIns="90000" rIns="90000" tIns="545760" bIns="545760" anchor="t">
                           <a:noAutofit/>
                         </wps:bodyPr>
                       </wps:wsp>
@@ -5244,17 +4888,17 @@
                   <v:fill o:detectmouseclick="t" on="false"/>
                   <w10:wrap type="none"/>
                 </v:line>
-                <v:oval id="shape_0" path="l-2147483648,-2147483643l-2147483628,-2147483627l-2147483648,-2147483643l-2147483626,-2147483625xe" fillcolor="#729fcf" stroked="t" o:allowincell="f" style="position:absolute;left:4327;top:4914;width:891;height:496;mso-wrap-style:none;v-text-anchor:middle">
+                <v:oval id="shape_0" path="l-2147483648,-2147483643l-2147483628,-2147483627l-2147483648,-2147483643l-2147483626,-2147483625xe" fillcolor="#729fcf" stroked="t" o:allowincell="f" style="position:absolute;left:4327;top:4914;width:890;height:495;mso-wrap-style:none;v-text-anchor:middle">
                   <v:fill o:detectmouseclick="t" type="solid" color2="#8d6030"/>
                   <v:stroke color="black" joinstyle="round" endcap="flat"/>
                   <w10:wrap type="none"/>
                 </v:oval>
-                <v:rect id="shape_0" path="m0,0l-2147483645,0l-2147483645,-2147483646l0,-2147483646xe" fillcolor="black" stroked="t" o:allowincell="f" style="position:absolute;left:951;top:1659;width:1122;height:496;mso-wrap-style:none;v-text-anchor:middle">
+                <v:rect id="shape_0" path="m0,0l-2147483645,0l-2147483645,-2147483646l0,-2147483646xe" fillcolor="black" stroked="t" o:allowincell="f" style="position:absolute;left:951;top:1659;width:1121;height:495;mso-wrap-style:none;v-text-anchor:middle">
                   <v:fill o:detectmouseclick="t" type="solid" color2="white"/>
                   <v:stroke color="white" joinstyle="round" endcap="flat"/>
                   <w10:wrap type="none"/>
                 </v:rect>
-                <v:rect id="shape_0" path="m0,0l-2147483645,0l-2147483645,-2147483646l0,-2147483646xe" fillcolor="white" stroked="t" o:allowincell="f" style="position:absolute;left:7026;top:2662;width:1118;height:495;mso-wrap-style:none;v-text-anchor:middle">
+                <v:rect id="shape_0" path="m0,0l-2147483645,0l-2147483645,-2147483646l0,-2147483646xe" fillcolor="white" stroked="t" o:allowincell="f" style="position:absolute;left:7026;top:2662;width:1117;height:494;mso-wrap-style:none;v-text-anchor:middle">
                   <v:fill o:detectmouseclick="t" type="solid" color2="black"/>
                   <v:stroke color="black" joinstyle="round" endcap="flat"/>
                   <w10:wrap type="none"/>
@@ -5284,7 +4928,7 @@
                   <v:fill o:detectmouseclick="t" on="false"/>
                   <w10:wrap type="none"/>
                 </v:line>
-                <v:rect id="shape_0" path="m0,0l-2147483645,0l-2147483645,-2147483646l0,-2147483646xe" stroked="f" o:allowincell="f" style="position:absolute;left:4102;top:4038;width:218;height:860;mso-wrap-style:square;v-text-anchor:top">
+                <v:rect id="shape_0" path="m0,0l-2147483645,0l-2147483645,-2147483646l0,-2147483646xe" stroked="f" o:allowincell="f" style="position:absolute;left:4102;top:4038;width:217;height:859;mso-wrap-style:square;v-text-anchor:top">
                   <v:textbox>
                     <w:txbxContent>
                       <w:p>
@@ -5323,7 +4967,7 @@
                   <v:stroke color="#3465a4" joinstyle="round" endcap="flat"/>
                   <w10:wrap type="none"/>
                 </v:rect>
-                <v:rect id="shape_0" path="m0,0l-2147483645,0l-2147483645,-2147483646l0,-2147483646xe" stroked="f" o:allowincell="f" style="position:absolute;left:5007;top:4038;width:428;height:860;mso-wrap-style:square;v-text-anchor:top">
+                <v:rect id="shape_0" path="m0,0l-2147483645,0l-2147483645,-2147483646l0,-2147483646xe" stroked="f" o:allowincell="f" style="position:absolute;left:5007;top:4038;width:427;height:859;mso-wrap-style:square;v-text-anchor:top">
                   <v:textbox>
                     <w:txbxContent>
                       <w:p>
@@ -5362,7 +5006,7 @@
                   <v:stroke color="#3465a4" joinstyle="round" endcap="flat"/>
                   <w10:wrap type="none"/>
                 </v:rect>
-                <v:rect id="shape_0" path="m0,0l-2147483645,0l-2147483645,-2147483646l0,-2147483646xe" stroked="f" o:allowincell="f" style="position:absolute;left:5007;top:3538;width:428;height:858;mso-wrap-style:square;v-text-anchor:top">
+                <v:rect id="shape_0" path="m0,0l-2147483645,0l-2147483645,-2147483646l0,-2147483646xe" stroked="f" o:allowincell="f" style="position:absolute;left:5007;top:3538;width:427;height:857;mso-wrap-style:square;v-text-anchor:top">
                   <v:textbox>
                     <w:txbxContent>
                       <w:p>
@@ -5401,7 +5045,7 @@
                   <v:stroke color="#3465a4" joinstyle="round" endcap="flat"/>
                   <w10:wrap type="none"/>
                 </v:rect>
-                <v:rect id="shape_0" path="m0,0l-2147483645,0l-2147483645,-2147483646l0,-2147483646xe" stroked="f" o:allowincell="f" style="position:absolute;left:5900;top:2535;width:447;height:857;mso-wrap-style:square;v-text-anchor:top">
+                <v:rect id="shape_0" path="m0,0l-2147483645,0l-2147483645,-2147483646l0,-2147483646xe" stroked="f" o:allowincell="f" style="position:absolute;left:5900;top:2535;width:446;height:856;mso-wrap-style:square;v-text-anchor:top">
                   <v:textbox>
                     <w:txbxContent>
                       <w:p>
@@ -5445,7 +5089,7 @@
                   <v:fill o:detectmouseclick="t" on="false"/>
                   <w10:wrap type="none"/>
                 </v:line>
-                <v:rect id="shape_0" path="m0,0l-2147483645,0l-2147483645,-2147483646l0,-2147483646xe" stroked="f" o:allowincell="f" style="position:absolute;left:951;top:3036;width:667;height:857;mso-wrap-style:square;v-text-anchor:top">
+                <v:rect id="shape_0" path="m0,0l-2147483645,0l-2147483645,-2147483646l0,-2147483646xe" stroked="f" o:allowincell="f" style="position:absolute;left:951;top:3036;width:666;height:856;mso-wrap-style:square;v-text-anchor:top">
                   <v:textbox>
                     <w:txbxContent>
                       <w:p>
@@ -5484,7 +5128,7 @@
                   <v:stroke color="#3465a4" joinstyle="round" endcap="flat"/>
                   <w10:wrap type="none"/>
                 </v:rect>
-                <v:rect id="shape_0" path="m0,0l-2147483645,0l-2147483645,-2147483646l0,-2147483646xe" stroked="f" o:allowincell="f" style="position:absolute;left:3201;top:1532;width:441;height:859;mso-wrap-style:square;v-text-anchor:top">
+                <v:rect id="shape_0" path="m0,0l-2147483645,0l-2147483645,-2147483646l0,-2147483646xe" stroked="f" o:allowincell="f" style="position:absolute;left:3201;top:1532;width:440;height:858;mso-wrap-style:square;v-text-anchor:top">
                   <v:textbox>
                     <w:txbxContent>
                       <w:p>
@@ -5608,7 +5252,7 @@
                           <w:p>
                             <w:pPr>
                               <w:pStyle w:val="FrameContents"/>
-                              <w:overflowPunct w:val="false"/>
+                              <w:overflowPunct w:val="true"/>
                               <w:spacing w:lineRule="auto" w:line="240" w:before="0" w:after="0"/>
                               <w:rPr>
                                 <w:color w:val="000000"/>
@@ -5664,7 +5308,7 @@
                     <w:p>
                       <w:pPr>
                         <w:pStyle w:val="FrameContents"/>
-                        <w:overflowPunct w:val="false"/>
+                        <w:overflowPunct w:val="true"/>
                         <w:spacing w:lineRule="auto" w:line="240" w:before="0" w:after="0"/>
                         <w:rPr>
                           <w:color w:val="000000"/>
@@ -5749,7 +5393,7 @@
                           <w:p>
                             <w:pPr>
                               <w:pStyle w:val="FrameContents"/>
-                              <w:overflowPunct w:val="false"/>
+                              <w:overflowPunct w:val="true"/>
                               <w:spacing w:lineRule="auto" w:line="240" w:before="0" w:after="0"/>
                               <w:rPr>
                                 <w:color w:val="000000"/>
@@ -5808,7 +5452,7 @@
                     <w:p>
                       <w:pPr>
                         <w:pStyle w:val="FrameContents"/>
-                        <w:overflowPunct w:val="false"/>
+                        <w:overflowPunct w:val="true"/>
                         <w:spacing w:lineRule="auto" w:line="240" w:before="0" w:after="0"/>
                         <w:rPr>
                           <w:color w:val="000000"/>
@@ -6176,41 +5820,7 @@
           <w:vertAlign w:val="baseline"/>
           <w:lang w:val="en-US" w:eastAsia="en-US" w:bidi="ar-SA"/>
         </w:rPr>
-        <w:t xml:space="preserve">Οι συντεταγμένες του βραχίονα αντιστοιχίζονται με τις συντεταγμένες </w:t>
-      </w:r>
-      <w:r>
-        <w:rPr>
-          <w:rFonts w:eastAsia="Arial" w:cs="" w:ascii="Calibri" w:hAnsi="Calibri" w:cstheme="minorBidi"/>
-          <w:b w:val="false"/>
-          <w:bCs w:val="false"/>
-          <w:color w:val="000000"/>
-          <w:kern w:val="0"/>
-          <w:position w:val="0"/>
-          <w:sz w:val="24"/>
-          <w:sz w:val="24"/>
-          <w:szCs w:val="24"/>
-          <w:u w:val="none"/>
-          <w:vertAlign w:val="baseline"/>
-          <w:lang w:val="en-US" w:eastAsia="en-US" w:bidi="ar-SA"/>
-        </w:rPr>
-        <w:t>του επιπέδου</w:t>
-      </w:r>
-      <w:r>
-        <w:rPr>
-          <w:rFonts w:eastAsia="Arial" w:cs="" w:ascii="Calibri" w:hAnsi="Calibri" w:cstheme="minorBidi"/>
-          <w:b w:val="false"/>
-          <w:bCs w:val="false"/>
-          <w:color w:val="000000"/>
-          <w:kern w:val="0"/>
-          <w:position w:val="0"/>
-          <w:sz w:val="24"/>
-          <w:sz w:val="24"/>
-          <w:szCs w:val="24"/>
-          <w:u w:val="none"/>
-          <w:vertAlign w:val="baseline"/>
-          <w:lang w:val="en-US" w:eastAsia="en-US" w:bidi="ar-SA"/>
-        </w:rPr>
-        <w:t xml:space="preserve"> σύμφωνα με τον παρακάτω πίνακα:</w:t>
+        <w:t>Οι συντεταγμένες του βραχίονα αντιστοιχίζονται με τις συντεταγμένες του επιπέδου σύμφωνα με τον παρακάτω πίνακα:</w:t>
       </w:r>
     </w:p>
     <w:tbl>
@@ -6483,75 +6093,7 @@
           <w:vertAlign w:val="baseline"/>
           <w:lang w:val="en-US" w:eastAsia="en-US" w:bidi="ar-SA"/>
         </w:rPr>
-        <w:t xml:space="preserve">Η τιμή y του βραχίονα θα είναι σταθερή, καθώς εξαρτάται από το ύψος των </w:t>
-      </w:r>
-      <w:r>
-        <w:rPr>
-          <w:rFonts w:eastAsia="Arial" w:cs="" w:ascii="Calibri" w:hAnsi="Calibri" w:cstheme="minorBidi"/>
-          <w:b w:val="false"/>
-          <w:bCs w:val="false"/>
-          <w:color w:val="000000"/>
-          <w:kern w:val="0"/>
-          <w:position w:val="0"/>
-          <w:sz w:val="24"/>
-          <w:sz w:val="24"/>
-          <w:szCs w:val="24"/>
-          <w:u w:val="none"/>
-          <w:vertAlign w:val="baseline"/>
-          <w:lang w:val="en-US" w:eastAsia="en-US" w:bidi="ar-SA"/>
-        </w:rPr>
-        <w:t>αντικειμένων</w:t>
-      </w:r>
-      <w:r>
-        <w:rPr>
-          <w:rFonts w:eastAsia="Arial" w:cs="" w:ascii="Calibri" w:hAnsi="Calibri" w:cstheme="minorBidi"/>
-          <w:b w:val="false"/>
-          <w:bCs w:val="false"/>
-          <w:color w:val="000000"/>
-          <w:kern w:val="0"/>
-          <w:position w:val="0"/>
-          <w:sz w:val="24"/>
-          <w:sz w:val="24"/>
-          <w:szCs w:val="24"/>
-          <w:u w:val="none"/>
-          <w:vertAlign w:val="baseline"/>
-          <w:lang w:val="en-US" w:eastAsia="en-US" w:bidi="ar-SA"/>
-        </w:rPr>
-        <w:t xml:space="preserve"> τ</w:t>
-      </w:r>
-      <w:r>
-        <w:rPr>
-          <w:rFonts w:eastAsia="Arial" w:cs="" w:ascii="Calibri" w:hAnsi="Calibri" w:cstheme="minorBidi"/>
-          <w:b w:val="false"/>
-          <w:bCs w:val="false"/>
-          <w:color w:val="000000"/>
-          <w:kern w:val="0"/>
-          <w:position w:val="0"/>
-          <w:sz w:val="24"/>
-          <w:sz w:val="24"/>
-          <w:szCs w:val="24"/>
-          <w:u w:val="none"/>
-          <w:vertAlign w:val="baseline"/>
-          <w:lang w:val="en-US" w:eastAsia="en-US" w:bidi="ar-SA"/>
-        </w:rPr>
-        <w:t>ου επιπέδου</w:t>
-      </w:r>
-      <w:r>
-        <w:rPr>
-          <w:rFonts w:eastAsia="Arial" w:cs="" w:ascii="Calibri" w:hAnsi="Calibri" w:cstheme="minorBidi"/>
-          <w:b w:val="false"/>
-          <w:bCs w:val="false"/>
-          <w:color w:val="000000"/>
-          <w:kern w:val="0"/>
-          <w:position w:val="0"/>
-          <w:sz w:val="24"/>
-          <w:sz w:val="24"/>
-          <w:szCs w:val="24"/>
-          <w:u w:val="none"/>
-          <w:vertAlign w:val="baseline"/>
-          <w:lang w:val="en-US" w:eastAsia="en-US" w:bidi="ar-SA"/>
-        </w:rPr>
-        <w:t xml:space="preserve"> και αποτελεί την 3</w:t>
+        <w:t>Η τιμή y του βραχίονα θα είναι σταθερή, καθώς εξαρτάται από το ύψος των αντικειμένων του επιπέδου και αποτελεί την 3</w:t>
       </w:r>
       <w:r>
         <w:rPr>
@@ -6663,20 +6205,7 @@
         <w:t xml:space="preserve">Ισχύει: </w:t>
       </w:r>
       <w:r>
-        <w:rPr>
-          <w:rFonts w:eastAsia="Arial" w:cs="" w:ascii="Calibri" w:hAnsi="Calibri" w:cstheme="minorBidi"/>
-          <w:b w:val="false"/>
-          <w:bCs w:val="false"/>
-          <w:color w:val="000000"/>
-          <w:kern w:val="0"/>
-          <w:position w:val="0"/>
-          <w:sz w:val="24"/>
-          <w:sz w:val="24"/>
-          <w:szCs w:val="24"/>
-          <w:u w:val="none"/>
-          <w:vertAlign w:val="baseline"/>
-          <w:lang w:val="en-US" w:eastAsia="en-US" w:bidi="ar-SA"/>
-        </w:rPr>
+        <w:rPr/>
       </w:r>
       <m:oMath xmlns:m="http://schemas.openxmlformats.org/officeDocument/2006/math">
         <m:r>
@@ -6692,16 +6221,10 @@
           <m:t xml:space="preserve">ω</m:t>
         </m:r>
         <m:r>
-          <m:t xml:space="preserve"> </m:t>
-        </m:r>
-        <m:r>
           <w:rPr>
             <w:rFonts w:ascii="Cambria Math" w:hAnsi="Cambria Math"/>
           </w:rPr>
           <m:t xml:space="preserve">∈</m:t>
-        </m:r>
-        <m:r>
-          <m:t xml:space="preserve"> </m:t>
         </m:r>
         <m:d>
           <m:dPr>
@@ -6760,9 +6283,6 @@
           </m:e>
         </m:d>
         <m:r>
-          <m:t xml:space="preserve"> </m:t>
-        </m:r>
-        <m:r>
           <w:rPr>
             <w:rFonts w:ascii="Cambria Math" w:hAnsi="Cambria Math"/>
           </w:rPr>
@@ -6816,16 +6336,10 @@
           </m:den>
         </m:f>
         <m:r>
-          <m:t xml:space="preserve"> </m:t>
-        </m:r>
-        <m:r>
           <w:rPr>
             <w:rFonts w:ascii="Cambria Math" w:hAnsi="Cambria Math"/>
           </w:rPr>
           <m:t xml:space="preserve">⇒</m:t>
-        </m:r>
-        <m:r>
-          <m:t xml:space="preserve"> </m:t>
         </m:r>
         <m:r>
           <w:rPr>
@@ -6878,16 +6392,10 @@
           </m:e>
         </m:d>
         <m:r>
-          <m:t xml:space="preserve"> </m:t>
-        </m:r>
-        <m:r>
           <w:rPr>
             <w:rFonts w:ascii="Cambria Math" w:hAnsi="Cambria Math"/>
           </w:rPr>
           <m:t xml:space="preserve">,</m:t>
-        </m:r>
-        <m:r>
-          <m:t xml:space="preserve"> </m:t>
         </m:r>
         <m:r>
           <w:rPr>
@@ -6908,16 +6416,10 @@
           <m:t xml:space="preserve">0</m:t>
         </m:r>
         <m:r>
-          <m:t xml:space="preserve"> </m:t>
-        </m:r>
-        <m:r>
           <w:rPr>
             <w:rFonts w:ascii="Cambria Math" w:hAnsi="Cambria Math"/>
           </w:rPr>
           <m:t xml:space="preserve">∧</m:t>
-        </m:r>
-        <m:r>
-          <m:t xml:space="preserve"> </m:t>
         </m:r>
         <m:r>
           <w:rPr>
@@ -6976,18 +6478,7 @@
         <w:t xml:space="preserve">Μετά από βαθμονόμιση: </w:t>
       </w:r>
       <w:r>
-        <w:rPr>
-          <w:rFonts w:eastAsia="Arial" w:cs="" w:ascii="Calibri" w:hAnsi="Calibri" w:cstheme="minorBidi"/>
-          <w:b w:val="false"/>
-          <w:bCs w:val="false"/>
-          <w:color w:val="000000"/>
-          <w:kern w:val="0"/>
-          <w:sz w:val="24"/>
-          <w:szCs w:val="24"/>
-          <w:u w:val="none"/>
-          <w:vertAlign w:val="subscript"/>
-          <w:lang w:val="en-US" w:eastAsia="en-US" w:bidi="ar-SA"/>
-        </w:rPr>
+        <w:rPr/>
       </w:r>
       <m:oMath xmlns:m="http://schemas.openxmlformats.org/officeDocument/2006/math">
         <m:sSub>
@@ -7045,16 +6536,10 @@
           </m:sub>
         </m:sSub>
         <m:r>
-          <m:t xml:space="preserve"> </m:t>
-        </m:r>
-        <m:r>
           <w:rPr>
             <w:rFonts w:ascii="Cambria Math" w:hAnsi="Cambria Math"/>
           </w:rPr>
           <m:t xml:space="preserve">,</m:t>
-        </m:r>
-        <m:r>
-          <m:t xml:space="preserve"> </m:t>
         </m:r>
         <m:sSub>
           <m:e>
@@ -7075,16 +6560,10 @@
           </m:sub>
         </m:sSub>
         <m:r>
-          <m:t xml:space="preserve"> </m:t>
-        </m:r>
-        <m:r>
           <w:rPr>
             <w:rFonts w:ascii="Cambria Math" w:hAnsi="Cambria Math"/>
           </w:rPr>
           <m:t xml:space="preserve">∈</m:t>
-        </m:r>
-        <m:r>
-          <m:t xml:space="preserve"> </m:t>
         </m:r>
         <m:d>
           <m:dPr>
@@ -7158,7 +6637,17 @@
         </w:rPr>
       </w:pPr>
       <w:r>
-        <w:rPr/>
+        <w:rPr>
+          <w:b w:val="false"/>
+          <w:bCs w:val="false"/>
+          <w:color w:val="000000"/>
+          <w:position w:val="0"/>
+          <w:sz w:val="24"/>
+          <w:sz w:val="24"/>
+          <w:szCs w:val="24"/>
+          <w:u w:val="none"/>
+          <w:vertAlign w:val="baseline"/>
+        </w:rPr>
       </w:r>
     </w:p>
     <w:p>
@@ -7214,7 +6703,17 @@
         </w:rPr>
       </w:pPr>
       <w:r>
-        <w:rPr/>
+        <w:rPr>
+          <w:b w:val="false"/>
+          <w:bCs w:val="false"/>
+          <w:color w:val="000000"/>
+          <w:position w:val="0"/>
+          <w:sz w:val="24"/>
+          <w:sz w:val="24"/>
+          <w:szCs w:val="24"/>
+          <w:u w:val="none"/>
+          <w:vertAlign w:val="baseline"/>
+        </w:rPr>
       </w:r>
     </w:p>
     <w:p>
@@ -7283,7 +6782,7 @@
         <mc:AlternateContent>
           <mc:Choice Requires="wpg">
             <w:drawing>
-              <wp:anchor behindDoc="0" distT="0" distB="0" distL="0" distR="0" simplePos="0" locked="0" layoutInCell="0" allowOverlap="1" relativeHeight="18">
+              <wp:anchor behindDoc="0" distT="0" distB="0" distL="0" distR="0" simplePos="0" locked="0" layoutInCell="0" allowOverlap="1" relativeHeight="8">
                 <wp:simplePos x="0" y="0"/>
                 <wp:positionH relativeFrom="column">
                   <wp:posOffset>3447415</wp:posOffset>
@@ -7291,7 +6790,7 @@
                 <wp:positionV relativeFrom="paragraph">
                   <wp:posOffset>-563245</wp:posOffset>
                 </wp:positionV>
-                <wp:extent cx="3519170" cy="4924425"/>
+                <wp:extent cx="3518535" cy="4923790"/>
                 <wp:effectExtent l="0" t="0" r="0" b="0"/>
                 <wp:wrapNone/>
                 <wp:docPr id="9" name="Group object 1"/>
@@ -7302,9 +6801,9 @@
                       <wpg:grpSpPr>
                         <a:xfrm>
                           <a:off x="0" y="0"/>
-                          <a:ext cx="3519000" cy="4924440"/>
+                          <a:ext cx="3518640" cy="4923720"/>
                           <a:chOff x="0" y="0"/>
-                          <a:chExt cx="3519000" cy="4924440"/>
+                          <a:chExt cx="3518640" cy="4923720"/>
                         </a:xfrm>
                       </wpg:grpSpPr>
                       <pic:pic xmlns:pic="http://schemas.openxmlformats.org/drawingml/2006/picture">
@@ -7319,7 +6818,7 @@
                         <pic:spPr>
                           <a:xfrm>
                             <a:off x="513000" y="0"/>
-                            <a:ext cx="2980080" cy="2367360"/>
+                            <a:ext cx="2979360" cy="2366640"/>
                           </a:xfrm>
                           <a:prstGeom prst="rect">
                             <a:avLst/>
@@ -7341,7 +6840,7 @@
                         <pic:spPr>
                           <a:xfrm>
                             <a:off x="0" y="720"/>
-                            <a:ext cx="429120" cy="2366640"/>
+                            <a:ext cx="428760" cy="2365920"/>
                           </a:xfrm>
                           <a:prstGeom prst="rect">
                             <a:avLst/>
@@ -7363,7 +6862,7 @@
                         <pic:spPr>
                           <a:xfrm>
                             <a:off x="527040" y="2407320"/>
-                            <a:ext cx="2991960" cy="293400"/>
+                            <a:ext cx="2991600" cy="292680"/>
                           </a:xfrm>
                           <a:prstGeom prst="rect">
                             <a:avLst/>
@@ -7431,8 +6930,8 @@
                         <wps:cNvSpPr/>
                         <wps:spPr>
                           <a:xfrm>
-                            <a:off x="610920" y="2182320"/>
-                            <a:ext cx="129600" cy="90000"/>
+                            <a:off x="610920" y="2181960"/>
+                            <a:ext cx="128880" cy="89640"/>
                           </a:xfrm>
                           <a:prstGeom prst="ellipse">
                             <a:avLst/>
@@ -7484,7 +6983,7 @@
                         <wps:spPr>
                           <a:xfrm>
                             <a:off x="5760" y="2750040"/>
-                            <a:ext cx="1541160" cy="2174400"/>
+                            <a:ext cx="1540440" cy="2173680"/>
                           </a:xfrm>
                           <a:prstGeom prst="rect">
                             <a:avLst/>
@@ -7534,7 +7033,7 @@
                             </w:p>
                           </w:txbxContent>
                         </wps:txbx>
-                        <wps:bodyPr lIns="90000" rIns="90000" tIns="2673360" bIns="2673360" anchor="t">
+                        <wps:bodyPr lIns="90000" rIns="90000" tIns="2174400" bIns="2174400" anchor="t">
                           <a:noAutofit/>
                         </wps:bodyPr>
                       </wps:wsp>
@@ -7546,7 +7045,7 @@
           </mc:Choice>
           <mc:Fallback>
             <w:pict>
-              <v:group id="shape_0" alt="Group object 1" style="position:absolute;margin-left:271.45pt;margin-top:-44.35pt;width:277.1pt;height:387.75pt" coordorigin="5429,-887" coordsize="5542,7755">
+              <v:group id="shape_0" alt="Group object 1" style="position:absolute;margin-left:271.45pt;margin-top:-44.35pt;width:277.05pt;height:387.65pt" coordorigin="5429,-887" coordsize="5541,7753">
                 <v:shapetype id="_x0000_t75" coordsize="21600,21600" o:spt="75" o:preferrelative="t" path="m@4@5l@4@11@9@11@9@5xe" filled="f" stroked="f">
                   <v:stroke joinstyle="miter"/>
                   <v:formulas>
@@ -7566,17 +7065,17 @@
                   <v:path o:extrusionok="f" gradientshapeok="t" o:connecttype="rect"/>
                   <o:lock v:ext="edit" aspectratio="t"/>
                 </v:shapetype>
-                <v:shape id="shape_0" stroked="f" o:allowincell="f" style="position:absolute;left:6237;top:-887;width:4692;height:3727;mso-wrap-style:none;v-text-anchor:middle" type="_x0000_t75">
+                <v:shape id="shape_0" stroked="f" o:allowincell="f" style="position:absolute;left:6237;top:-887;width:4691;height:3726;mso-wrap-style:none;v-text-anchor:middle" type="_x0000_t75">
                   <v:imagedata r:id="rId3" o:detectmouseclick="t"/>
                   <v:stroke color="#3465a4" joinstyle="round" endcap="flat"/>
                   <w10:wrap type="none"/>
                 </v:shape>
-                <v:shape id="shape_0" stroked="f" o:allowincell="f" style="position:absolute;left:5429;top:-886;width:675;height:3726;mso-wrap-style:none;v-text-anchor:middle" type="_x0000_t75">
+                <v:shape id="shape_0" stroked="f" o:allowincell="f" style="position:absolute;left:5429;top:-886;width:674;height:3725;mso-wrap-style:none;v-text-anchor:middle" type="_x0000_t75">
                   <v:imagedata r:id="rId4" o:detectmouseclick="t"/>
                   <v:stroke color="#3465a4" joinstyle="round" endcap="flat"/>
                   <w10:wrap type="none"/>
                 </v:shape>
-                <v:shape id="shape_0" stroked="f" o:allowincell="f" style="position:absolute;left:6259;top:2904;width:4711;height:461;mso-wrap-style:none;v-text-anchor:middle" type="_x0000_t75">
+                <v:shape id="shape_0" stroked="f" o:allowincell="f" style="position:absolute;left:6259;top:2904;width:4710;height:460;mso-wrap-style:none;v-text-anchor:middle" type="_x0000_t75">
                   <v:imagedata r:id="rId5" o:detectmouseclick="t"/>
                   <v:stroke color="#3465a4" joinstyle="round" endcap="flat"/>
                   <w10:wrap type="none"/>
@@ -7591,7 +7090,7 @@
                   <v:fill o:detectmouseclick="t" on="false"/>
                   <w10:wrap type="none"/>
                 </v:line>
-                <v:oval id="shape_0" path="l-2147483648,-2147483643l-2147483628,-2147483627l-2147483648,-2147483643l-2147483626,-2147483625xe" fillcolor="black" stroked="t" o:allowincell="f" style="position:absolute;left:6391;top:2549;width:203;height:141;mso-wrap-style:none;v-text-anchor:middle">
+                <v:oval id="shape_0" path="l-2147483648,-2147483643l-2147483628,-2147483627l-2147483648,-2147483643l-2147483626,-2147483625xe" fillcolor="black" stroked="t" o:allowincell="f" style="position:absolute;left:6391;top:2549;width:202;height:140;mso-wrap-style:none;v-text-anchor:middle">
                   <v:fill o:detectmouseclick="t" type="solid" color2="white"/>
                   <v:stroke color="#3465a4" joinstyle="round" endcap="flat"/>
                   <w10:wrap type="none"/>
@@ -7601,7 +7100,7 @@
                   <v:fill o:detectmouseclick="t" on="false"/>
                   <w10:wrap type="none"/>
                 </v:line>
-                <v:rect id="shape_0" path="m0,0l-2147483645,0l-2147483645,-2147483646l0,-2147483646xe" stroked="f" o:allowincell="f" style="position:absolute;left:5438;top:3444;width:2426;height:3423;mso-wrap-style:square;v-text-anchor:top">
+                <v:rect id="shape_0" path="m0,0l-2147483645,0l-2147483645,-2147483646l0,-2147483646xe" stroked="f" o:allowincell="f" style="position:absolute;left:5438;top:3444;width:2425;height:3422;mso-wrap-style:square;v-text-anchor:top">
                   <v:textbox>
                     <w:txbxContent>
                       <w:p>
@@ -7716,7 +7215,7 @@
         <mc:AlternateContent>
           <mc:Choice Requires="wps">
             <w:drawing>
-              <wp:anchor behindDoc="0" distT="38100" distB="38100" distL="635" distR="635" simplePos="0" locked="0" layoutInCell="0" allowOverlap="1" relativeHeight="19">
+              <wp:anchor behindDoc="0" distT="38100" distB="38100" distL="635" distR="635" simplePos="0" locked="0" layoutInCell="0" allowOverlap="1" relativeHeight="9">
                 <wp:simplePos x="0" y="0"/>
                 <wp:positionH relativeFrom="column">
                   <wp:posOffset>4021455</wp:posOffset>
@@ -7773,7 +7272,7 @@
         <mc:AlternateContent>
           <mc:Choice Requires="wps">
             <w:drawing>
-              <wp:anchor behindDoc="0" distT="1270" distB="635" distL="1270" distR="635" simplePos="0" locked="0" layoutInCell="0" allowOverlap="1" relativeHeight="20">
+              <wp:anchor behindDoc="0" distT="1270" distB="635" distL="1270" distR="635" simplePos="0" locked="0" layoutInCell="0" allowOverlap="1" relativeHeight="10">
                 <wp:simplePos x="0" y="0"/>
                 <wp:positionH relativeFrom="column">
                   <wp:posOffset>5547360</wp:posOffset>
@@ -9215,7 +8714,7 @@
             </w:pPr>
             <w:r>
               <w:rPr/>
-              <w:t>-4</w:t>
+              <w:t>3</w:t>
             </w:r>
           </w:p>
         </w:tc>
@@ -9258,7 +8757,7 @@
             </w:pPr>
             <w:r>
               <w:rPr/>
-              <w:t>-3</w:t>
+              <w:t>2</w:t>
             </w:r>
           </w:p>
         </w:tc>
@@ -9301,7 +8800,7 @@
             </w:pPr>
             <w:r>
               <w:rPr/>
-              <w:t>-2</w:t>
+              <w:t>1</w:t>
             </w:r>
           </w:p>
         </w:tc>
@@ -9344,7 +8843,7 @@
             </w:pPr>
             <w:r>
               <w:rPr/>
-              <w:t>-1</w:t>
+              <w:t>0</w:t>
             </w:r>
           </w:p>
         </w:tc>
@@ -9387,7 +8886,7 @@
             </w:pPr>
             <w:r>
               <w:rPr/>
-              <w:t>0</w:t>
+              <w:t>-1</w:t>
             </w:r>
           </w:p>
         </w:tc>
@@ -9430,7 +8929,7 @@
             </w:pPr>
             <w:r>
               <w:rPr/>
-              <w:t>1</w:t>
+              <w:t>-2</w:t>
             </w:r>
           </w:p>
         </w:tc>
@@ -9473,7 +8972,7 @@
             </w:pPr>
             <w:r>
               <w:rPr/>
-              <w:t>2</w:t>
+              <w:t>-3</w:t>
             </w:r>
           </w:p>
         </w:tc>
@@ -9516,7 +9015,7 @@
             </w:pPr>
             <w:r>
               <w:rPr/>
-              <w:t>3</w:t>
+              <w:t>-4</w:t>
             </w:r>
           </w:p>
         </w:tc>

</xml_diff>

<commit_message>
Updated grip functions for slower movements and added Raise function. Also extended research while adding FindHypotenuse function.
</commit_message>
<xml_diff>
--- a/KinematicsAndCoordinates/kinematcis_coordinates.docx
+++ b/KinematicsAndCoordinates/kinematcis_coordinates.docx
@@ -4201,7 +4201,7 @@
                         <wps:spPr>
                           <a:xfrm>
                             <a:off x="3000960" y="2862720"/>
-                            <a:ext cx="565920" cy="315000"/>
+                            <a:ext cx="565200" cy="314280"/>
                           </a:xfrm>
                           <a:prstGeom prst="ellipse">
                             <a:avLst/>
@@ -4228,7 +4228,7 @@
                         <wps:spPr>
                           <a:xfrm>
                             <a:off x="857160" y="795600"/>
-                            <a:ext cx="712440" cy="315000"/>
+                            <a:ext cx="711720" cy="314280"/>
                           </a:xfrm>
                           <a:prstGeom prst="rect">
                             <a:avLst/>
@@ -4255,7 +4255,7 @@
                         <wps:spPr>
                           <a:xfrm>
                             <a:off x="4714920" y="1432440"/>
-                            <a:ext cx="709920" cy="314280"/>
+                            <a:ext cx="709200" cy="313560"/>
                           </a:xfrm>
                           <a:prstGeom prst="rect">
                             <a:avLst/>
@@ -4359,7 +4359,7 @@
                         <wps:spPr>
                           <a:xfrm>
                             <a:off x="2903760" y="2486160"/>
-                            <a:ext cx="423720" cy="147240"/>
+                            <a:ext cx="423000" cy="146520"/>
                           </a:xfrm>
                           <a:custGeom>
                             <a:avLst/>
@@ -4399,7 +4399,7 @@
                         <wps:spPr>
                           <a:xfrm>
                             <a:off x="3295800" y="2583720"/>
-                            <a:ext cx="507960" cy="128160"/>
+                            <a:ext cx="507240" cy="127800"/>
                           </a:xfrm>
                           <a:custGeom>
                             <a:avLst/>
@@ -4496,7 +4496,7 @@
                         <wps:spPr>
                           <a:xfrm>
                             <a:off x="2858040" y="2306160"/>
-                            <a:ext cx="138600" cy="546120"/>
+                            <a:ext cx="137880" cy="545400"/>
                           </a:xfrm>
                           <a:prstGeom prst="rect">
                             <a:avLst/>
@@ -4546,7 +4546,7 @@
                             </w:p>
                           </w:txbxContent>
                         </wps:txbx>
-                        <wps:bodyPr lIns="90000" rIns="90000" tIns="547200" bIns="547200" anchor="t">
+                        <wps:bodyPr lIns="90000" rIns="90000" tIns="545760" bIns="545760" anchor="t">
                           <a:noAutofit/>
                         </wps:bodyPr>
                       </wps:wsp>
@@ -4555,7 +4555,7 @@
                         <wps:spPr>
                           <a:xfrm>
                             <a:off x="3432960" y="2306160"/>
-                            <a:ext cx="271800" cy="546120"/>
+                            <a:ext cx="271080" cy="545400"/>
                           </a:xfrm>
                           <a:prstGeom prst="rect">
                             <a:avLst/>
@@ -4605,7 +4605,7 @@
                             </w:p>
                           </w:txbxContent>
                         </wps:txbx>
-                        <wps:bodyPr lIns="90000" rIns="90000" tIns="547200" bIns="547200" anchor="t">
+                        <wps:bodyPr lIns="90000" rIns="90000" tIns="545760" bIns="545760" anchor="t">
                           <a:noAutofit/>
                         </wps:bodyPr>
                       </wps:wsp>
@@ -4614,7 +4614,7 @@
                         <wps:spPr>
                           <a:xfrm>
                             <a:off x="3432960" y="1989000"/>
-                            <a:ext cx="271800" cy="544680"/>
+                            <a:ext cx="271080" cy="544320"/>
                           </a:xfrm>
                           <a:prstGeom prst="rect">
                             <a:avLst/>
@@ -4664,7 +4664,7 @@
                             </w:p>
                           </w:txbxContent>
                         </wps:txbx>
-                        <wps:bodyPr lIns="90000" rIns="90000" tIns="545760" bIns="545760" anchor="t">
+                        <wps:bodyPr lIns="90000" rIns="90000" tIns="545040" bIns="545040" anchor="t">
                           <a:noAutofit/>
                         </wps:bodyPr>
                       </wps:wsp>
@@ -4673,7 +4673,7 @@
                         <wps:spPr>
                           <a:xfrm>
                             <a:off x="3999960" y="1351800"/>
-                            <a:ext cx="283680" cy="544320"/>
+                            <a:ext cx="283320" cy="543600"/>
                           </a:xfrm>
                           <a:prstGeom prst="rect">
                             <a:avLst/>
@@ -4761,7 +4761,7 @@
                         <wps:spPr>
                           <a:xfrm>
                             <a:off x="857160" y="1670040"/>
-                            <a:ext cx="423720" cy="544320"/>
+                            <a:ext cx="423000" cy="543600"/>
                           </a:xfrm>
                           <a:prstGeom prst="rect">
                             <a:avLst/>
@@ -4820,7 +4820,7 @@
                         <wps:spPr>
                           <a:xfrm>
                             <a:off x="2286000" y="714960"/>
-                            <a:ext cx="280080" cy="545400"/>
+                            <a:ext cx="279360" cy="544680"/>
                           </a:xfrm>
                           <a:prstGeom prst="rect">
                             <a:avLst/>
@@ -4888,17 +4888,17 @@
                   <v:fill o:detectmouseclick="t" on="false"/>
                   <w10:wrap type="none"/>
                 </v:line>
-                <v:oval id="shape_0" path="l-2147483648,-2147483643l-2147483628,-2147483627l-2147483648,-2147483643l-2147483626,-2147483625xe" fillcolor="#729fcf" stroked="t" o:allowincell="f" style="position:absolute;left:4327;top:4914;width:890;height:495;mso-wrap-style:none;v-text-anchor:middle">
+                <v:oval id="shape_0" path="l-2147483648,-2147483643l-2147483628,-2147483627l-2147483648,-2147483643l-2147483626,-2147483625xe" fillcolor="#729fcf" stroked="t" o:allowincell="f" style="position:absolute;left:4327;top:4914;width:889;height:494;mso-wrap-style:none;v-text-anchor:middle">
                   <v:fill o:detectmouseclick="t" type="solid" color2="#8d6030"/>
                   <v:stroke color="black" joinstyle="round" endcap="flat"/>
                   <w10:wrap type="none"/>
                 </v:oval>
-                <v:rect id="shape_0" path="m0,0l-2147483645,0l-2147483645,-2147483646l0,-2147483646xe" fillcolor="black" stroked="t" o:allowincell="f" style="position:absolute;left:951;top:1659;width:1121;height:495;mso-wrap-style:none;v-text-anchor:middle">
+                <v:rect id="shape_0" path="m0,0l-2147483645,0l-2147483645,-2147483646l0,-2147483646xe" fillcolor="black" stroked="t" o:allowincell="f" style="position:absolute;left:951;top:1659;width:1120;height:494;mso-wrap-style:none;v-text-anchor:middle">
                   <v:fill o:detectmouseclick="t" type="solid" color2="white"/>
                   <v:stroke color="white" joinstyle="round" endcap="flat"/>
                   <w10:wrap type="none"/>
                 </v:rect>
-                <v:rect id="shape_0" path="m0,0l-2147483645,0l-2147483645,-2147483646l0,-2147483646xe" fillcolor="white" stroked="t" o:allowincell="f" style="position:absolute;left:7026;top:2662;width:1117;height:494;mso-wrap-style:none;v-text-anchor:middle">
+                <v:rect id="shape_0" path="m0,0l-2147483645,0l-2147483645,-2147483646l0,-2147483646xe" fillcolor="white" stroked="t" o:allowincell="f" style="position:absolute;left:7026;top:2662;width:1116;height:493;mso-wrap-style:none;v-text-anchor:middle">
                   <v:fill o:detectmouseclick="t" type="solid" color2="black"/>
                   <v:stroke color="black" joinstyle="round" endcap="flat"/>
                   <w10:wrap type="none"/>
@@ -4928,7 +4928,7 @@
                   <v:fill o:detectmouseclick="t" on="false"/>
                   <w10:wrap type="none"/>
                 </v:line>
-                <v:rect id="shape_0" path="m0,0l-2147483645,0l-2147483645,-2147483646l0,-2147483646xe" stroked="f" o:allowincell="f" style="position:absolute;left:4102;top:4038;width:217;height:859;mso-wrap-style:square;v-text-anchor:top">
+                <v:rect id="shape_0" path="m0,0l-2147483645,0l-2147483645,-2147483646l0,-2147483646xe" stroked="f" o:allowincell="f" style="position:absolute;left:4102;top:4038;width:216;height:858;mso-wrap-style:square;v-text-anchor:top">
                   <v:textbox>
                     <w:txbxContent>
                       <w:p>
@@ -4967,7 +4967,7 @@
                   <v:stroke color="#3465a4" joinstyle="round" endcap="flat"/>
                   <w10:wrap type="none"/>
                 </v:rect>
-                <v:rect id="shape_0" path="m0,0l-2147483645,0l-2147483645,-2147483646l0,-2147483646xe" stroked="f" o:allowincell="f" style="position:absolute;left:5007;top:4038;width:427;height:859;mso-wrap-style:square;v-text-anchor:top">
+                <v:rect id="shape_0" path="m0,0l-2147483645,0l-2147483645,-2147483646l0,-2147483646xe" stroked="f" o:allowincell="f" style="position:absolute;left:5007;top:4038;width:426;height:858;mso-wrap-style:square;v-text-anchor:top">
                   <v:textbox>
                     <w:txbxContent>
                       <w:p>
@@ -5006,7 +5006,7 @@
                   <v:stroke color="#3465a4" joinstyle="round" endcap="flat"/>
                   <w10:wrap type="none"/>
                 </v:rect>
-                <v:rect id="shape_0" path="m0,0l-2147483645,0l-2147483645,-2147483646l0,-2147483646xe" stroked="f" o:allowincell="f" style="position:absolute;left:5007;top:3538;width:427;height:857;mso-wrap-style:square;v-text-anchor:top">
+                <v:rect id="shape_0" path="m0,0l-2147483645,0l-2147483645,-2147483646l0,-2147483646xe" stroked="f" o:allowincell="f" style="position:absolute;left:5007;top:3538;width:426;height:856;mso-wrap-style:square;v-text-anchor:top">
                   <v:textbox>
                     <w:txbxContent>
                       <w:p>
@@ -5045,7 +5045,7 @@
                   <v:stroke color="#3465a4" joinstyle="round" endcap="flat"/>
                   <w10:wrap type="none"/>
                 </v:rect>
-                <v:rect id="shape_0" path="m0,0l-2147483645,0l-2147483645,-2147483646l0,-2147483646xe" stroked="f" o:allowincell="f" style="position:absolute;left:5900;top:2535;width:446;height:856;mso-wrap-style:square;v-text-anchor:top">
+                <v:rect id="shape_0" path="m0,0l-2147483645,0l-2147483645,-2147483646l0,-2147483646xe" stroked="f" o:allowincell="f" style="position:absolute;left:5900;top:2535;width:445;height:855;mso-wrap-style:square;v-text-anchor:top">
                   <v:textbox>
                     <w:txbxContent>
                       <w:p>
@@ -5089,7 +5089,7 @@
                   <v:fill o:detectmouseclick="t" on="false"/>
                   <w10:wrap type="none"/>
                 </v:line>
-                <v:rect id="shape_0" path="m0,0l-2147483645,0l-2147483645,-2147483646l0,-2147483646xe" stroked="f" o:allowincell="f" style="position:absolute;left:951;top:3036;width:666;height:856;mso-wrap-style:square;v-text-anchor:top">
+                <v:rect id="shape_0" path="m0,0l-2147483645,0l-2147483645,-2147483646l0,-2147483646xe" stroked="f" o:allowincell="f" style="position:absolute;left:951;top:3036;width:665;height:855;mso-wrap-style:square;v-text-anchor:top">
                   <v:textbox>
                     <w:txbxContent>
                       <w:p>
@@ -5128,7 +5128,7 @@
                   <v:stroke color="#3465a4" joinstyle="round" endcap="flat"/>
                   <w10:wrap type="none"/>
                 </v:rect>
-                <v:rect id="shape_0" path="m0,0l-2147483645,0l-2147483645,-2147483646l0,-2147483646xe" stroked="f" o:allowincell="f" style="position:absolute;left:3201;top:1532;width:440;height:858;mso-wrap-style:square;v-text-anchor:top">
+                <v:rect id="shape_0" path="m0,0l-2147483645,0l-2147483645,-2147483646l0,-2147483646xe" stroked="f" o:allowincell="f" style="position:absolute;left:3201;top:1532;width:439;height:857;mso-wrap-style:square;v-text-anchor:top">
                   <v:textbox>
                     <w:txbxContent>
                       <w:p>
@@ -5252,7 +5252,7 @@
                           <w:p>
                             <w:pPr>
                               <w:pStyle w:val="FrameContents"/>
-                              <w:overflowPunct w:val="true"/>
+                              <w:overflowPunct w:val="false"/>
                               <w:spacing w:lineRule="auto" w:line="240" w:before="0" w:after="0"/>
                               <w:rPr>
                                 <w:color w:val="000000"/>
@@ -5308,7 +5308,7 @@
                     <w:p>
                       <w:pPr>
                         <w:pStyle w:val="FrameContents"/>
-                        <w:overflowPunct w:val="true"/>
+                        <w:overflowPunct w:val="false"/>
                         <w:spacing w:lineRule="auto" w:line="240" w:before="0" w:after="0"/>
                         <w:rPr>
                           <w:color w:val="000000"/>
@@ -5393,7 +5393,7 @@
                           <w:p>
                             <w:pPr>
                               <w:pStyle w:val="FrameContents"/>
-                              <w:overflowPunct w:val="true"/>
+                              <w:overflowPunct w:val="false"/>
                               <w:spacing w:lineRule="auto" w:line="240" w:before="0" w:after="0"/>
                               <w:rPr>
                                 <w:color w:val="000000"/>
@@ -5452,7 +5452,7 @@
                     <w:p>
                       <w:pPr>
                         <w:pStyle w:val="FrameContents"/>
-                        <w:overflowPunct w:val="true"/>
+                        <w:overflowPunct w:val="false"/>
                         <w:spacing w:lineRule="auto" w:line="240" w:before="0" w:after="0"/>
                         <w:rPr>
                           <w:color w:val="000000"/>
@@ -6125,7 +6125,41 @@
           <w:vertAlign w:val="baseline"/>
           <w:lang w:val="en-US" w:eastAsia="en-US" w:bidi="ar-SA"/>
         </w:rPr>
-        <w:t xml:space="preserve"> διάσταση του βραχίονα. Η τιμή της μεταβλητής y θα οριστεί πειραματικά.</w:t>
+        <w:t xml:space="preserve"> διάσταση του βραχίονα. Η τιμή της μεταβλητής y </w:t>
+      </w:r>
+      <w:r>
+        <w:rPr>
+          <w:rFonts w:eastAsia="Arial" w:cs="" w:ascii="Calibri" w:hAnsi="Calibri" w:cstheme="minorBidi"/>
+          <w:b w:val="false"/>
+          <w:bCs w:val="false"/>
+          <w:color w:val="000000"/>
+          <w:kern w:val="0"/>
+          <w:position w:val="0"/>
+          <w:sz w:val="24"/>
+          <w:sz w:val="24"/>
+          <w:szCs w:val="24"/>
+          <w:u w:val="none"/>
+          <w:vertAlign w:val="baseline"/>
+          <w:lang w:val="en-US" w:eastAsia="en-US" w:bidi="ar-SA"/>
+        </w:rPr>
+        <w:t>ορίζεται από την διαφορά ύψους πιονιού και της βάσης του χεριού</w:t>
+      </w:r>
+      <w:r>
+        <w:rPr>
+          <w:rFonts w:eastAsia="Arial" w:cs="" w:ascii="Calibri" w:hAnsi="Calibri" w:cstheme="minorBidi"/>
+          <w:b w:val="false"/>
+          <w:bCs w:val="false"/>
+          <w:color w:val="000000"/>
+          <w:kern w:val="0"/>
+          <w:position w:val="0"/>
+          <w:sz w:val="24"/>
+          <w:sz w:val="24"/>
+          <w:szCs w:val="24"/>
+          <w:u w:val="none"/>
+          <w:vertAlign w:val="baseline"/>
+          <w:lang w:val="en-US" w:eastAsia="en-US" w:bidi="ar-SA"/>
+        </w:rPr>
+        <w:t>.</w:t>
       </w:r>
     </w:p>
     <w:p>
@@ -6515,7 +6549,7 @@
           <w:rPr>
             <w:rFonts w:ascii="Cambria Math" w:hAnsi="Cambria Math"/>
           </w:rPr>
-          <m:t xml:space="preserve">−</m:t>
+          <m:t xml:space="preserve">∓</m:t>
         </m:r>
         <m:sSub>
           <m:e>
@@ -6790,7 +6824,7 @@
                 <wp:positionV relativeFrom="paragraph">
                   <wp:posOffset>-563245</wp:posOffset>
                 </wp:positionV>
-                <wp:extent cx="3518535" cy="4923790"/>
+                <wp:extent cx="3517900" cy="4923155"/>
                 <wp:effectExtent l="0" t="0" r="0" b="0"/>
                 <wp:wrapNone/>
                 <wp:docPr id="9" name="Group object 1"/>
@@ -6801,9 +6835,9 @@
                       <wpg:grpSpPr>
                         <a:xfrm>
                           <a:off x="0" y="0"/>
-                          <a:ext cx="3518640" cy="4923720"/>
+                          <a:ext cx="3517920" cy="4923000"/>
                           <a:chOff x="0" y="0"/>
-                          <a:chExt cx="3518640" cy="4923720"/>
+                          <a:chExt cx="3517920" cy="4923000"/>
                         </a:xfrm>
                       </wpg:grpSpPr>
                       <pic:pic xmlns:pic="http://schemas.openxmlformats.org/drawingml/2006/picture">
@@ -6818,7 +6852,7 @@
                         <pic:spPr>
                           <a:xfrm>
                             <a:off x="513000" y="0"/>
-                            <a:ext cx="2979360" cy="2366640"/>
+                            <a:ext cx="2978640" cy="2365920"/>
                           </a:xfrm>
                           <a:prstGeom prst="rect">
                             <a:avLst/>
@@ -6840,7 +6874,7 @@
                         <pic:spPr>
                           <a:xfrm>
                             <a:off x="0" y="720"/>
-                            <a:ext cx="428760" cy="2365920"/>
+                            <a:ext cx="428040" cy="2365200"/>
                           </a:xfrm>
                           <a:prstGeom prst="rect">
                             <a:avLst/>
@@ -6862,7 +6896,7 @@
                         <pic:spPr>
                           <a:xfrm>
                             <a:off x="527040" y="2407320"/>
-                            <a:ext cx="2991600" cy="292680"/>
+                            <a:ext cx="2990880" cy="291960"/>
                           </a:xfrm>
                           <a:prstGeom prst="rect">
                             <a:avLst/>
@@ -6931,7 +6965,7 @@
                         <wps:spPr>
                           <a:xfrm>
                             <a:off x="610920" y="2181960"/>
-                            <a:ext cx="128880" cy="89640"/>
+                            <a:ext cx="128160" cy="88920"/>
                           </a:xfrm>
                           <a:prstGeom prst="ellipse">
                             <a:avLst/>
@@ -6983,7 +7017,7 @@
                         <wps:spPr>
                           <a:xfrm>
                             <a:off x="5760" y="2750040"/>
-                            <a:ext cx="1540440" cy="2173680"/>
+                            <a:ext cx="1539720" cy="2172960"/>
                           </a:xfrm>
                           <a:prstGeom prst="rect">
                             <a:avLst/>
@@ -7045,7 +7079,7 @@
           </mc:Choice>
           <mc:Fallback>
             <w:pict>
-              <v:group id="shape_0" alt="Group object 1" style="position:absolute;margin-left:271.45pt;margin-top:-44.35pt;width:277.05pt;height:387.65pt" coordorigin="5429,-887" coordsize="5541,7753">
+              <v:group id="shape_0" alt="Group object 1" style="position:absolute;margin-left:271.45pt;margin-top:-44.35pt;width:277pt;height:387.6pt" coordorigin="5429,-887" coordsize="5540,7752">
                 <v:shapetype id="_x0000_t75" coordsize="21600,21600" o:spt="75" o:preferrelative="t" path="m@4@5l@4@11@9@11@9@5xe" filled="f" stroked="f">
                   <v:stroke joinstyle="miter"/>
                   <v:formulas>
@@ -7065,17 +7099,17 @@
                   <v:path o:extrusionok="f" gradientshapeok="t" o:connecttype="rect"/>
                   <o:lock v:ext="edit" aspectratio="t"/>
                 </v:shapetype>
-                <v:shape id="shape_0" stroked="f" o:allowincell="f" style="position:absolute;left:6237;top:-887;width:4691;height:3726;mso-wrap-style:none;v-text-anchor:middle" type="_x0000_t75">
+                <v:shape id="shape_0" stroked="f" o:allowincell="f" style="position:absolute;left:6237;top:-887;width:4690;height:3725;mso-wrap-style:none;v-text-anchor:middle" type="_x0000_t75">
                   <v:imagedata r:id="rId3" o:detectmouseclick="t"/>
                   <v:stroke color="#3465a4" joinstyle="round" endcap="flat"/>
                   <w10:wrap type="none"/>
                 </v:shape>
-                <v:shape id="shape_0" stroked="f" o:allowincell="f" style="position:absolute;left:5429;top:-886;width:674;height:3725;mso-wrap-style:none;v-text-anchor:middle" type="_x0000_t75">
+                <v:shape id="shape_0" stroked="f" o:allowincell="f" style="position:absolute;left:5429;top:-886;width:673;height:3724;mso-wrap-style:none;v-text-anchor:middle" type="_x0000_t75">
                   <v:imagedata r:id="rId4" o:detectmouseclick="t"/>
                   <v:stroke color="#3465a4" joinstyle="round" endcap="flat"/>
                   <w10:wrap type="none"/>
                 </v:shape>
-                <v:shape id="shape_0" stroked="f" o:allowincell="f" style="position:absolute;left:6259;top:2904;width:4710;height:460;mso-wrap-style:none;v-text-anchor:middle" type="_x0000_t75">
+                <v:shape id="shape_0" stroked="f" o:allowincell="f" style="position:absolute;left:6259;top:2904;width:4709;height:459;mso-wrap-style:none;v-text-anchor:middle" type="_x0000_t75">
                   <v:imagedata r:id="rId5" o:detectmouseclick="t"/>
                   <v:stroke color="#3465a4" joinstyle="round" endcap="flat"/>
                   <w10:wrap type="none"/>
@@ -7090,7 +7124,7 @@
                   <v:fill o:detectmouseclick="t" on="false"/>
                   <w10:wrap type="none"/>
                 </v:line>
-                <v:oval id="shape_0" path="l-2147483648,-2147483643l-2147483628,-2147483627l-2147483648,-2147483643l-2147483626,-2147483625xe" fillcolor="black" stroked="t" o:allowincell="f" style="position:absolute;left:6391;top:2549;width:202;height:140;mso-wrap-style:none;v-text-anchor:middle">
+                <v:oval id="shape_0" path="l-2147483648,-2147483643l-2147483628,-2147483627l-2147483648,-2147483643l-2147483626,-2147483625xe" fillcolor="black" stroked="t" o:allowincell="f" style="position:absolute;left:6391;top:2549;width:201;height:139;mso-wrap-style:none;v-text-anchor:middle">
                   <v:fill o:detectmouseclick="t" type="solid" color2="white"/>
                   <v:stroke color="#3465a4" joinstyle="round" endcap="flat"/>
                   <w10:wrap type="none"/>
@@ -7100,7 +7134,7 @@
                   <v:fill o:detectmouseclick="t" on="false"/>
                   <w10:wrap type="none"/>
                 </v:line>
-                <v:rect id="shape_0" path="m0,0l-2147483645,0l-2147483645,-2147483646l0,-2147483646xe" stroked="f" o:allowincell="f" style="position:absolute;left:5438;top:3444;width:2425;height:3422;mso-wrap-style:square;v-text-anchor:top">
+                <v:rect id="shape_0" path="m0,0l-2147483645,0l-2147483645,-2147483646l0,-2147483646xe" stroked="f" o:allowincell="f" style="position:absolute;left:5438;top:3444;width:2424;height:3421;mso-wrap-style:square;v-text-anchor:top">
                   <v:textbox>
                     <w:txbxContent>
                       <w:p>
@@ -7186,31 +7220,8 @@
           <w:szCs w:val="22"/>
           <w:lang w:val="en-US" w:eastAsia="en-US" w:bidi="ar-SA"/>
         </w:rPr>
-        <w:t>ίζεται ως σημείο αναφοράς, διότι εκεί</w:t>
+        <w:t xml:space="preserve">ίζεται ως </w:t>
       </w:r>
-    </w:p>
-    <w:p>
-      <w:pPr>
-        <w:pStyle w:val="Normal"/>
-        <w:rPr/>
-      </w:pPr>
-      <w:r>
-        <w:rPr>
-          <w:rFonts w:eastAsia="Arial" w:cs="" w:cstheme="minorBidi"/>
-          <w:color w:val="auto"/>
-          <w:kern w:val="0"/>
-          <w:sz w:val="24"/>
-          <w:szCs w:val="22"/>
-          <w:lang w:val="en-US" w:eastAsia="en-US" w:bidi="ar-SA"/>
-        </w:rPr>
-        <w:t>βρίσκεται ο βραχίονας και “βλέπει” στο κέντρο</w:t>
-      </w:r>
-    </w:p>
-    <w:p>
-      <w:pPr>
-        <w:pStyle w:val="Normal"/>
-        <w:rPr/>
-      </w:pPr>
       <w:r>
         <mc:AlternateContent>
           <mc:Choice Requires="wps">
@@ -7336,7 +7347,52 @@
           <w:szCs w:val="22"/>
           <w:lang w:val="en-US" w:eastAsia="en-US" w:bidi="ar-SA"/>
         </w:rPr>
-        <w:t>του τετραγώνου</w:t>
+        <w:t>αρχ</w:t>
+      </w:r>
+      <w:r>
+        <w:rPr>
+          <w:rFonts w:eastAsia="Arial" w:cs="" w:cstheme="minorBidi"/>
+          <w:color w:val="auto"/>
+          <w:kern w:val="0"/>
+          <w:sz w:val="24"/>
+          <w:szCs w:val="22"/>
+          <w:lang w:val="en-US" w:eastAsia="en-US" w:bidi="ar-SA"/>
+        </w:rPr>
+        <w:t>ή των συντεταγμένων της σκακίερας.</w:t>
+      </w:r>
+    </w:p>
+    <w:p>
+      <w:pPr>
+        <w:pStyle w:val="Normal"/>
+        <w:rPr/>
+      </w:pPr>
+      <w:r>
+        <w:rPr>
+          <w:rFonts w:eastAsia="Arial" w:cs="" w:cstheme="minorBidi"/>
+          <w:color w:val="auto"/>
+          <w:kern w:val="0"/>
+          <w:sz w:val="24"/>
+          <w:szCs w:val="22"/>
+          <w:lang w:val="en-US" w:eastAsia="en-US" w:bidi="ar-SA"/>
+        </w:rPr>
+        <w:t>Δεν χρησημοποιείται το σημείο (0,0) διότι οι υπολογισμοί πάντα πρέπει να οδηγούν</w:t>
+      </w:r>
+    </w:p>
+    <w:p>
+      <w:pPr>
+        <w:pStyle w:val="Normal"/>
+        <w:rPr/>
+      </w:pPr>
+      <w:r>
+        <w:rPr>
+          <w:rFonts w:eastAsia="Arial" w:cs="" w:cstheme="minorBidi"/>
+          <w:color w:val="auto"/>
+          <w:kern w:val="0"/>
+          <w:sz w:val="24"/>
+          <w:szCs w:val="22"/>
+          <w:lang w:val="en-US" w:eastAsia="en-US" w:bidi="ar-SA"/>
+        </w:rPr>
+        <w:t>στα κέντρα των τετραγώνων.</w:t>
       </w:r>
     </w:p>
     <w:p>
@@ -7459,36 +7515,6 @@
           <w:lang w:val="en-US" w:eastAsia="en-US" w:bidi="ar-SA"/>
         </w:rPr>
         <w:t xml:space="preserve"> </w:t>
-      </w:r>
-    </w:p>
-    <w:p>
-      <w:pPr>
-        <w:pStyle w:val="Normal"/>
-        <w:rPr>
-          <w:rFonts w:ascii="Arial" w:hAnsi="Arial" w:eastAsia="Arial"/>
-          <w:sz w:val="24"/>
-        </w:rPr>
-      </w:pPr>
-      <w:r>
-        <w:rPr>
-          <w:rFonts w:eastAsia="Arial"/>
-          <w:sz w:val="24"/>
-        </w:rPr>
-      </w:r>
-    </w:p>
-    <w:p>
-      <w:pPr>
-        <w:pStyle w:val="Normal"/>
-        <w:rPr>
-          <w:rFonts w:ascii="Arial" w:hAnsi="Arial" w:eastAsia="Arial"/>
-          <w:sz w:val="24"/>
-        </w:rPr>
-      </w:pPr>
-      <w:r>
-        <w:rPr>
-          <w:rFonts w:eastAsia="Arial"/>
-          <w:sz w:val="24"/>
-        </w:rPr>
       </w:r>
     </w:p>
     <w:tbl>
@@ -8561,56 +8587,6 @@
         </w:rPr>
       </w:r>
     </w:p>
-    <w:p>
-      <w:pPr>
-        <w:pStyle w:val="Normal"/>
-        <w:spacing w:before="0" w:after="200"/>
-        <w:jc w:val="center"/>
-        <w:rPr>
-          <w:rFonts w:ascii="Arial" w:hAnsi="Arial" w:eastAsia="Arial" w:cs="" w:cstheme="minorBidi"/>
-          <w:color w:val="auto"/>
-          <w:kern w:val="0"/>
-          <w:sz w:val="24"/>
-          <w:szCs w:val="22"/>
-          <w:lang w:val="en-US" w:eastAsia="en-US" w:bidi="ar-SA"/>
-        </w:rPr>
-      </w:pPr>
-      <w:r>
-        <w:rPr>
-          <w:rFonts w:eastAsia="Arial" w:cs="" w:cstheme="minorBidi"/>
-          <w:color w:val="auto"/>
-          <w:kern w:val="0"/>
-          <w:sz w:val="24"/>
-          <w:szCs w:val="22"/>
-          <w:lang w:val="en-US" w:eastAsia="en-US" w:bidi="ar-SA"/>
-        </w:rPr>
-      </w:r>
-    </w:p>
-    <w:p>
-      <w:pPr>
-        <w:pStyle w:val="Normal"/>
-        <w:spacing w:before="0" w:after="200"/>
-        <w:jc w:val="center"/>
-        <w:rPr>
-          <w:rFonts w:ascii="Arial" w:hAnsi="Arial" w:eastAsia="Arial" w:cs="" w:cstheme="minorBidi"/>
-          <w:color w:val="auto"/>
-          <w:kern w:val="0"/>
-          <w:sz w:val="24"/>
-          <w:szCs w:val="22"/>
-          <w:lang w:val="en-US" w:eastAsia="en-US" w:bidi="ar-SA"/>
-        </w:rPr>
-      </w:pPr>
-      <w:r>
-        <w:rPr>
-          <w:rFonts w:eastAsia="Arial" w:cs="" w:cstheme="minorBidi"/>
-          <w:color w:val="auto"/>
-          <w:kern w:val="0"/>
-          <w:sz w:val="24"/>
-          <w:szCs w:val="22"/>
-          <w:lang w:val="en-US" w:eastAsia="en-US" w:bidi="ar-SA"/>
-        </w:rPr>
-      </w:r>
-    </w:p>
     <w:tbl>
       <w:tblPr>
         <w:tblW w:w="5000" w:type="pct"/>
@@ -9996,6 +9972,1820 @@
           <w:lang w:val="en-US" w:eastAsia="en-US" w:bidi="ar-SA"/>
         </w:rPr>
         <w:t>y</w:t>
+      </w:r>
+    </w:p>
+    <w:p>
+      <w:pPr>
+        <w:pStyle w:val="Normal"/>
+        <w:spacing w:before="0" w:after="200"/>
+        <w:ind w:left="720" w:hanging="0"/>
+        <w:jc w:val="left"/>
+        <w:rPr>
+          <w:b w:val="false"/>
+          <w:b w:val="false"/>
+          <w:bCs w:val="false"/>
+          <w:color w:val="000000"/>
+          <w:position w:val="0"/>
+          <w:sz w:val="24"/>
+          <w:sz w:val="24"/>
+          <w:szCs w:val="24"/>
+          <w:u w:val="none"/>
+          <w:vertAlign w:val="baseline"/>
+        </w:rPr>
+      </w:pPr>
+      <w:r>
+        <w:rPr/>
+      </w:r>
+    </w:p>
+    <w:p>
+      <w:pPr>
+        <w:pStyle w:val="Normal"/>
+        <w:spacing w:before="0" w:after="200"/>
+        <w:ind w:left="720" w:hanging="0"/>
+        <w:jc w:val="left"/>
+        <w:rPr>
+          <w:b w:val="false"/>
+          <w:b w:val="false"/>
+          <w:bCs w:val="false"/>
+          <w:color w:val="000000"/>
+          <w:position w:val="0"/>
+          <w:sz w:val="24"/>
+          <w:sz w:val="24"/>
+          <w:szCs w:val="24"/>
+          <w:u w:val="none"/>
+          <w:vertAlign w:val="baseline"/>
+        </w:rPr>
+      </w:pPr>
+      <w:r>
+        <w:rPr/>
+      </w:r>
+    </w:p>
+    <w:p>
+      <w:pPr>
+        <w:pStyle w:val="Normal"/>
+        <w:spacing w:before="0" w:after="200"/>
+        <w:ind w:hanging="0"/>
+        <w:jc w:val="left"/>
+        <w:rPr/>
+      </w:pPr>
+      <w:r>
+        <w:rPr/>
+        <w:t>-</w:t>
+      </w:r>
+      <w:r>
+        <w:rPr>
+          <w:rFonts w:eastAsia="Arial" w:cs="" w:cstheme="minorBidi"/>
+          <w:color w:val="auto"/>
+          <w:kern w:val="0"/>
+          <w:sz w:val="24"/>
+          <w:szCs w:val="22"/>
+          <w:u w:val="single"/>
+          <w:lang w:val="en-US" w:eastAsia="en-US" w:bidi="ar-SA"/>
+        </w:rPr>
+        <w:t xml:space="preserve">Προσθήκη μετατόπισης στις συντεταγμένες </w:t>
+      </w:r>
+      <w:r>
+        <w:rPr>
+          <w:rFonts w:eastAsia="Arial" w:cs="" w:cstheme="minorBidi"/>
+          <w:color w:val="auto"/>
+          <w:kern w:val="0"/>
+          <w:sz w:val="24"/>
+          <w:szCs w:val="22"/>
+          <w:u w:val="single"/>
+          <w:lang w:val="en-US" w:eastAsia="en-US" w:bidi="ar-SA"/>
+        </w:rPr>
+        <w:t>z</w:t>
+      </w:r>
+      <w:r>
+        <w:rPr>
+          <w:rFonts w:eastAsia="Arial" w:cs="" w:cstheme="minorBidi"/>
+          <w:color w:val="auto"/>
+          <w:kern w:val="0"/>
+          <w:sz w:val="24"/>
+          <w:szCs w:val="22"/>
+          <w:lang w:val="en-US" w:eastAsia="en-US" w:bidi="ar-SA"/>
+        </w:rPr>
+        <w:t>:</w:t>
+      </w:r>
+    </w:p>
+    <w:p>
+      <w:pPr>
+        <w:pStyle w:val="Normal"/>
+        <w:spacing w:before="0" w:after="200"/>
+        <w:ind w:hanging="0"/>
+        <w:jc w:val="left"/>
+        <w:rPr>
+          <w:rFonts w:ascii="Arial" w:hAnsi="Arial" w:eastAsia="Arial" w:cs="" w:cstheme="minorBidi"/>
+          <w:color w:val="auto"/>
+          <w:kern w:val="0"/>
+          <w:sz w:val="24"/>
+          <w:szCs w:val="22"/>
+          <w:lang w:val="en-US" w:eastAsia="en-US" w:bidi="ar-SA"/>
+        </w:rPr>
+      </w:pPr>
+      <w:r>
+        <w:rPr/>
+      </w:r>
+    </w:p>
+    <w:p>
+      <w:pPr>
+        <w:pStyle w:val="Normal"/>
+        <w:spacing w:before="0" w:after="200"/>
+        <w:ind w:hanging="0"/>
+        <w:jc w:val="left"/>
+        <w:rPr>
+          <w:rFonts w:ascii="Arial" w:hAnsi="Arial" w:eastAsia="Arial" w:cs="" w:cstheme="minorBidi"/>
+          <w:color w:val="auto"/>
+          <w:kern w:val="0"/>
+          <w:sz w:val="24"/>
+          <w:szCs w:val="22"/>
+          <w:lang w:val="en-US" w:eastAsia="en-US" w:bidi="ar-SA"/>
+        </w:rPr>
+      </w:pPr>
+      <w:r>
+        <w:rPr/>
+      </w:r>
+    </w:p>
+    <w:p>
+      <w:pPr>
+        <w:pStyle w:val="Normal"/>
+        <w:spacing w:before="0" w:after="200"/>
+        <w:ind w:hanging="0"/>
+        <w:jc w:val="left"/>
+        <w:rPr>
+          <w:rFonts w:ascii="Arial" w:hAnsi="Arial" w:eastAsia="Arial" w:cs="" w:cstheme="minorBidi"/>
+          <w:color w:val="auto"/>
+          <w:kern w:val="0"/>
+          <w:sz w:val="24"/>
+          <w:szCs w:val="22"/>
+          <w:lang w:val="en-US" w:eastAsia="en-US" w:bidi="ar-SA"/>
+        </w:rPr>
+      </w:pPr>
+      <w:r>
+        <w:rPr/>
+        <mc:AlternateContent>
+          <mc:Choice Requires="wps">
+            <w:drawing>
+              <wp:anchor behindDoc="0" distT="0" distB="0" distL="0" distR="0" simplePos="0" locked="0" layoutInCell="0" allowOverlap="1" relativeHeight="25">
+                <wp:simplePos x="0" y="0"/>
+                <wp:positionH relativeFrom="column">
+                  <wp:posOffset>3270885</wp:posOffset>
+                </wp:positionH>
+                <wp:positionV relativeFrom="paragraph">
+                  <wp:posOffset>1315720</wp:posOffset>
+                </wp:positionV>
+                <wp:extent cx="219075" cy="180975"/>
+                <wp:effectExtent l="0" t="0" r="0" b="0"/>
+                <wp:wrapNone/>
+                <wp:docPr id="12" name="Text Frame 3"/>
+                <a:graphic xmlns:a="http://schemas.openxmlformats.org/drawingml/2006/main">
+                  <a:graphicData uri="http://schemas.microsoft.com/office/word/2010/wordprocessingShape">
+                    <wps:wsp>
+                      <wps:cNvSpPr txBox="1"/>
+                      <wps:spPr>
+                        <a:xfrm>
+                          <a:off x="0" y="0"/>
+                          <a:ext cx="219240" cy="181080"/>
+                        </a:xfrm>
+                        <a:prstGeom prst="rect">
+                          <a:avLst/>
+                        </a:prstGeom>
+                        <a:noFill/>
+                        <a:ln w="0">
+                          <a:noFill/>
+                        </a:ln>
+                      </wps:spPr>
+                      <wps:txbx>
+                        <w:txbxContent>
+                          <w:p>
+                            <w:pPr>
+                              <w:overflowPunct w:val="false"/>
+                              <w:spacing w:before="0" w:after="0" w:lineRule="auto" w:line="240"/>
+                              <w:rPr/>
+                            </w:pPr>
+                            <w:r>
+                              <w:rPr>
+                                <w:sz w:val="22"/>
+                                <w:rFonts w:ascii="Cambria" w:hAnsi="Cambria" w:eastAsia="ＭＳ 明朝" w:asciiTheme="minorHAnsi" w:cstheme="minorBidi" w:eastAsiaTheme="minorEastAsia" w:hAnsiTheme="minorHAnsi"/>
+                              </w:rPr>
+                              <w:t>D</w:t>
+                            </w:r>
+                          </w:p>
+                        </w:txbxContent>
+                      </wps:txbx>
+                      <wps:bodyPr wrap="square" lIns="0" rIns="0" tIns="0" bIns="0" anchor="t">
+                        <a:noAutofit/>
+                      </wps:bodyPr>
+                    </wps:wsp>
+                  </a:graphicData>
+                </a:graphic>
+              </wp:anchor>
+            </w:drawing>
+          </mc:Choice>
+          <mc:Fallback>
+            <w:pict>
+              <v:shapetype id="_x0000_t202" coordsize="21600,21600" o:spt="202" path="m,l,21600l21600,21600l21600,xe">
+                <v:stroke joinstyle="miter"/>
+                <v:path gradientshapeok="t" o:connecttype="rect"/>
+              </v:shapetype>
+              <v:shape id="shape_0" ID="Text Frame 3" stroked="f" o:allowincell="f" style="position:absolute;margin-left:257.55pt;margin-top:103.6pt;width:17.2pt;height:14.2pt;mso-wrap-style:square;v-text-anchor:top" type="_x0000_t202">
+                <v:textbox>
+                  <w:txbxContent>
+                    <w:p>
+                      <w:pPr>
+                        <w:overflowPunct w:val="false"/>
+                        <w:spacing w:before="0" w:after="0" w:lineRule="auto" w:line="240"/>
+                        <w:rPr/>
+                      </w:pPr>
+                      <w:r>
+                        <w:rPr>
+                          <w:sz w:val="22"/>
+                          <w:rFonts w:ascii="Cambria" w:hAnsi="Cambria" w:eastAsia="ＭＳ 明朝" w:asciiTheme="minorHAnsi" w:cstheme="minorBidi" w:eastAsiaTheme="minorEastAsia" w:hAnsiTheme="minorHAnsi"/>
+                        </w:rPr>
+                        <w:t>D</w:t>
+                      </w:r>
+                    </w:p>
+                  </w:txbxContent>
+                </v:textbox>
+                <v:fill o:detectmouseclick="t" on="false"/>
+                <v:stroke color="black" joinstyle="round" endcap="round"/>
+                <w10:wrap type="none"/>
+              </v:shape>
+            </w:pict>
+          </mc:Fallback>
+        </mc:AlternateContent>
+        <mc:AlternateContent>
+          <mc:Choice Requires="wps">
+            <w:drawing>
+              <wp:anchor behindDoc="0" distT="0" distB="0" distL="0" distR="0" simplePos="0" locked="0" layoutInCell="0" allowOverlap="1" relativeHeight="26">
+                <wp:simplePos x="0" y="0"/>
+                <wp:positionH relativeFrom="column">
+                  <wp:posOffset>1546860</wp:posOffset>
+                </wp:positionH>
+                <wp:positionV relativeFrom="paragraph">
+                  <wp:posOffset>49530</wp:posOffset>
+                </wp:positionV>
+                <wp:extent cx="323850" cy="274955"/>
+                <wp:effectExtent l="0" t="0" r="0" b="0"/>
+                <wp:wrapNone/>
+                <wp:docPr id="13" name="Text Frame 4"/>
+                <a:graphic xmlns:a="http://schemas.openxmlformats.org/drawingml/2006/main">
+                  <a:graphicData uri="http://schemas.microsoft.com/office/word/2010/wordprocessingShape">
+                    <wps:wsp>
+                      <wps:cNvSpPr txBox="1"/>
+                      <wps:spPr>
+                        <a:xfrm>
+                          <a:off x="0" y="0"/>
+                          <a:ext cx="324000" cy="275040"/>
+                        </a:xfrm>
+                        <a:prstGeom prst="rect">
+                          <a:avLst/>
+                        </a:prstGeom>
+                        <a:noFill/>
+                        <a:ln w="0">
+                          <a:noFill/>
+                        </a:ln>
+                      </wps:spPr>
+                      <wps:txbx>
+                        <w:txbxContent>
+                          <w:p>
+                            <w:pPr>
+                              <w:overflowPunct w:val="false"/>
+                              <w:spacing w:before="0" w:after="0" w:lineRule="auto" w:line="240"/>
+                              <w:rPr/>
+                            </w:pPr>
+                            <w:r>
+                              <w:rPr>
+                                <w:sz w:val="22"/>
+                                <w:rFonts w:ascii="Cambria" w:hAnsi="Cambria" w:eastAsia="ＭＳ 明朝" w:asciiTheme="minorHAnsi" w:cstheme="minorBidi" w:eastAsiaTheme="minorEastAsia" w:hAnsiTheme="minorHAnsi"/>
+                              </w:rPr>
+                              <w:t>z</w:t>
+                            </w:r>
+                            <w:r>
+                              <w:rPr>
+                                <w:sz w:val="22"/>
+                                <w:vertAlign w:val="subscript"/>
+                                <w:rFonts w:ascii="Cambria" w:hAnsi="Cambria" w:eastAsia="ＭＳ 明朝" w:asciiTheme="minorHAnsi" w:cstheme="minorBidi" w:eastAsiaTheme="minorEastAsia" w:hAnsiTheme="minorHAnsi"/>
+                              </w:rPr>
+                              <w:t>i-1</w:t>
+                            </w:r>
+                          </w:p>
+                        </w:txbxContent>
+                      </wps:txbx>
+                      <wps:bodyPr wrap="square" lIns="0" rIns="0" tIns="0" bIns="0" anchor="t">
+                        <a:noAutofit/>
+                      </wps:bodyPr>
+                    </wps:wsp>
+                  </a:graphicData>
+                </a:graphic>
+              </wp:anchor>
+            </w:drawing>
+          </mc:Choice>
+          <mc:Fallback>
+            <w:pict>
+              <v:shape id="shape_0" ID="Text Frame 4" stroked="f" o:allowincell="f" style="position:absolute;margin-left:121.8pt;margin-top:3.9pt;width:25.45pt;height:21.6pt;mso-wrap-style:square;v-text-anchor:top" type="_x0000_t202">
+                <v:textbox>
+                  <w:txbxContent>
+                    <w:p>
+                      <w:pPr>
+                        <w:overflowPunct w:val="false"/>
+                        <w:spacing w:before="0" w:after="0" w:lineRule="auto" w:line="240"/>
+                        <w:rPr/>
+                      </w:pPr>
+                      <w:r>
+                        <w:rPr>
+                          <w:sz w:val="22"/>
+                          <w:rFonts w:ascii="Cambria" w:hAnsi="Cambria" w:eastAsia="ＭＳ 明朝" w:asciiTheme="minorHAnsi" w:cstheme="minorBidi" w:eastAsiaTheme="minorEastAsia" w:hAnsiTheme="minorHAnsi"/>
+                        </w:rPr>
+                        <w:t>z</w:t>
+                      </w:r>
+                      <w:r>
+                        <w:rPr>
+                          <w:sz w:val="22"/>
+                          <w:vertAlign w:val="subscript"/>
+                          <w:rFonts w:ascii="Cambria" w:hAnsi="Cambria" w:eastAsia="ＭＳ 明朝" w:asciiTheme="minorHAnsi" w:cstheme="minorBidi" w:eastAsiaTheme="minorEastAsia" w:hAnsiTheme="minorHAnsi"/>
+                        </w:rPr>
+                        <w:t>i-1</w:t>
+                      </w:r>
+                    </w:p>
+                  </w:txbxContent>
+                </v:textbox>
+                <v:fill o:detectmouseclick="t" on="false"/>
+                <v:stroke color="black" joinstyle="round" endcap="round"/>
+                <w10:wrap type="none"/>
+              </v:shape>
+            </w:pict>
+          </mc:Fallback>
+        </mc:AlternateContent>
+        <mc:AlternateContent>
+          <mc:Choice Requires="wps">
+            <w:drawing>
+              <wp:anchor behindDoc="0" distT="0" distB="0" distL="0" distR="0" simplePos="0" locked="0" layoutInCell="0" allowOverlap="1" relativeHeight="27">
+                <wp:simplePos x="0" y="0"/>
+                <wp:positionH relativeFrom="column">
+                  <wp:posOffset>4623435</wp:posOffset>
+                </wp:positionH>
+                <wp:positionV relativeFrom="paragraph">
+                  <wp:posOffset>78105</wp:posOffset>
+                </wp:positionV>
+                <wp:extent cx="333375" cy="203835"/>
+                <wp:effectExtent l="0" t="0" r="0" b="0"/>
+                <wp:wrapNone/>
+                <wp:docPr id="14" name="Text Frame 5"/>
+                <a:graphic xmlns:a="http://schemas.openxmlformats.org/drawingml/2006/main">
+                  <a:graphicData uri="http://schemas.microsoft.com/office/word/2010/wordprocessingShape">
+                    <wps:wsp>
+                      <wps:cNvSpPr txBox="1"/>
+                      <wps:spPr>
+                        <a:xfrm>
+                          <a:off x="0" y="0"/>
+                          <a:ext cx="333360" cy="203760"/>
+                        </a:xfrm>
+                        <a:prstGeom prst="rect">
+                          <a:avLst/>
+                        </a:prstGeom>
+                        <a:noFill/>
+                        <a:ln w="0">
+                          <a:noFill/>
+                        </a:ln>
+                      </wps:spPr>
+                      <wps:txbx>
+                        <w:txbxContent>
+                          <w:p>
+                            <w:pPr>
+                              <w:overflowPunct w:val="false"/>
+                              <w:spacing w:before="0" w:after="0" w:lineRule="auto" w:line="240"/>
+                              <w:rPr/>
+                            </w:pPr>
+                            <w:r>
+                              <w:rPr>
+                                <w:sz w:val="22"/>
+                                <w:rFonts w:ascii="Cambria" w:hAnsi="Cambria" w:eastAsia="ＭＳ 明朝" w:asciiTheme="minorHAnsi" w:cstheme="minorBidi" w:eastAsiaTheme="minorEastAsia" w:hAnsiTheme="minorHAnsi"/>
+                              </w:rPr>
+                              <w:t>z</w:t>
+                            </w:r>
+                            <w:r>
+                              <w:rPr>
+                                <w:sz w:val="22"/>
+                                <w:vertAlign w:val="subscript"/>
+                                <w:rFonts w:ascii="Cambria" w:hAnsi="Cambria" w:eastAsia="ＭＳ 明朝" w:asciiTheme="minorHAnsi" w:cstheme="minorBidi" w:eastAsiaTheme="minorEastAsia" w:hAnsiTheme="minorHAnsi"/>
+                              </w:rPr>
+                              <w:t>i+1</w:t>
+                            </w:r>
+                          </w:p>
+                        </w:txbxContent>
+                      </wps:txbx>
+                      <wps:bodyPr wrap="square" lIns="0" rIns="0" tIns="0" bIns="0" anchor="t">
+                        <a:noAutofit/>
+                      </wps:bodyPr>
+                    </wps:wsp>
+                  </a:graphicData>
+                </a:graphic>
+              </wp:anchor>
+            </w:drawing>
+          </mc:Choice>
+          <mc:Fallback>
+            <w:pict>
+              <v:shape id="shape_0" ID="Text Frame 5" stroked="f" o:allowincell="f" style="position:absolute;margin-left:364.05pt;margin-top:6.15pt;width:26.2pt;height:16pt;mso-wrap-style:square;v-text-anchor:top" type="_x0000_t202">
+                <v:textbox>
+                  <w:txbxContent>
+                    <w:p>
+                      <w:pPr>
+                        <w:overflowPunct w:val="false"/>
+                        <w:spacing w:before="0" w:after="0" w:lineRule="auto" w:line="240"/>
+                        <w:rPr/>
+                      </w:pPr>
+                      <w:r>
+                        <w:rPr>
+                          <w:sz w:val="22"/>
+                          <w:rFonts w:ascii="Cambria" w:hAnsi="Cambria" w:eastAsia="ＭＳ 明朝" w:asciiTheme="minorHAnsi" w:cstheme="minorBidi" w:eastAsiaTheme="minorEastAsia" w:hAnsiTheme="minorHAnsi"/>
+                        </w:rPr>
+                        <w:t>z</w:t>
+                      </w:r>
+                      <w:r>
+                        <w:rPr>
+                          <w:sz w:val="22"/>
+                          <w:vertAlign w:val="subscript"/>
+                          <w:rFonts w:ascii="Cambria" w:hAnsi="Cambria" w:eastAsia="ＭＳ 明朝" w:asciiTheme="minorHAnsi" w:cstheme="minorBidi" w:eastAsiaTheme="minorEastAsia" w:hAnsiTheme="minorHAnsi"/>
+                        </w:rPr>
+                        <w:t>i+1</w:t>
+                      </w:r>
+                    </w:p>
+                  </w:txbxContent>
+                </v:textbox>
+                <v:fill o:detectmouseclick="t" on="false"/>
+                <v:stroke color="black" joinstyle="round" endcap="round"/>
+                <w10:wrap type="none"/>
+              </v:shape>
+            </w:pict>
+          </mc:Fallback>
+        </mc:AlternateContent>
+        <mc:AlternateContent>
+          <mc:Choice Requires="wps">
+            <w:drawing>
+              <wp:anchor behindDoc="0" distT="0" distB="0" distL="0" distR="0" simplePos="0" locked="0" layoutInCell="0" allowOverlap="1" relativeHeight="30">
+                <wp:simplePos x="0" y="0"/>
+                <wp:positionH relativeFrom="column">
+                  <wp:align>center</wp:align>
+                </wp:positionH>
+                <wp:positionV relativeFrom="paragraph">
+                  <wp:posOffset>2506345</wp:posOffset>
+                </wp:positionV>
+                <wp:extent cx="371475" cy="342900"/>
+                <wp:effectExtent l="1270" t="635" r="635" b="1270"/>
+                <wp:wrapNone/>
+                <wp:docPr id="15" name="Shape 2"/>
+                <a:graphic xmlns:a="http://schemas.openxmlformats.org/drawingml/2006/main">
+                  <a:graphicData uri="http://schemas.microsoft.com/office/word/2010/wordprocessingShape">
+                    <wps:wsp>
+                      <wps:cNvSpPr/>
+                      <wps:spPr>
+                        <a:xfrm>
+                          <a:off x="0" y="0"/>
+                          <a:ext cx="371520" cy="343080"/>
+                        </a:xfrm>
+                        <a:prstGeom prst="ellipse">
+                          <a:avLst/>
+                        </a:prstGeom>
+                        <a:solidFill>
+                          <a:srgbClr val="729fcf"/>
+                        </a:solidFill>
+                        <a:ln w="0">
+                          <a:solidFill>
+                            <a:srgbClr val="3465a4"/>
+                          </a:solidFill>
+                        </a:ln>
+                      </wps:spPr>
+                      <wps:style>
+                        <a:lnRef idx="0"/>
+                        <a:fillRef idx="0"/>
+                        <a:effectRef idx="0"/>
+                        <a:fontRef idx="minor"/>
+                      </wps:style>
+                      <wps:bodyPr/>
+                    </wps:wsp>
+                  </a:graphicData>
+                </a:graphic>
+              </wp:anchor>
+            </w:drawing>
+          </mc:Choice>
+          <mc:Fallback>
+            <w:pict>
+              <v:oval id="shape_0" ID="Shape 2" fillcolor="#729fcf" stroked="t" o:allowincell="f" style="position:absolute;margin-left:234.65pt;margin-top:197.35pt;width:29.2pt;height:26.95pt;mso-wrap-style:none;v-text-anchor:middle;mso-position-horizontal:center">
+                <v:fill o:detectmouseclick="t" color2="#8d6030"/>
+                <v:stroke color="#3465a4" joinstyle="round" endcap="flat"/>
+                <w10:wrap type="none"/>
+              </v:oval>
+            </w:pict>
+          </mc:Fallback>
+        </mc:AlternateContent>
+        <mc:AlternateContent>
+          <mc:Choice Requires="wps">
+            <w:drawing>
+              <wp:anchor behindDoc="0" distT="0" distB="0" distL="0" distR="0" simplePos="0" locked="0" layoutInCell="0" allowOverlap="1" relativeHeight="31">
+                <wp:simplePos x="0" y="0"/>
+                <wp:positionH relativeFrom="column">
+                  <wp:align>left</wp:align>
+                </wp:positionH>
+                <wp:positionV relativeFrom="paragraph">
+                  <wp:posOffset>210820</wp:posOffset>
+                </wp:positionV>
+                <wp:extent cx="257175" cy="257175"/>
+                <wp:effectExtent l="1270" t="1270" r="0" b="0"/>
+                <wp:wrapNone/>
+                <wp:docPr id="16" name="Shape 3"/>
+                <a:graphic xmlns:a="http://schemas.openxmlformats.org/drawingml/2006/main">
+                  <a:graphicData uri="http://schemas.microsoft.com/office/word/2010/wordprocessingShape">
+                    <wps:wsp>
+                      <wps:cNvSpPr/>
+                      <wps:spPr>
+                        <a:xfrm>
+                          <a:off x="0" y="0"/>
+                          <a:ext cx="257040" cy="257040"/>
+                        </a:xfrm>
+                        <a:prstGeom prst="rect">
+                          <a:avLst/>
+                        </a:prstGeom>
+                        <a:solidFill>
+                          <a:srgbClr val="729fcf"/>
+                        </a:solidFill>
+                        <a:ln w="0">
+                          <a:solidFill>
+                            <a:srgbClr val="3465a4"/>
+                          </a:solidFill>
+                        </a:ln>
+                      </wps:spPr>
+                      <wps:style>
+                        <a:lnRef idx="0"/>
+                        <a:fillRef idx="0"/>
+                        <a:effectRef idx="0"/>
+                        <a:fontRef idx="minor"/>
+                      </wps:style>
+                      <wps:bodyPr/>
+                    </wps:wsp>
+                  </a:graphicData>
+                </a:graphic>
+              </wp:anchor>
+            </w:drawing>
+          </mc:Choice>
+          <mc:Fallback>
+            <w:pict>
+              <v:rect id="shape_0" ID="Shape 3" fillcolor="#729fcf" stroked="t" o:allowincell="f" style="position:absolute;margin-left:0pt;margin-top:16.6pt;width:20.2pt;height:20.2pt;mso-wrap-style:none;v-text-anchor:middle;mso-position-horizontal:left">
+                <v:fill o:detectmouseclick="t" color2="#8d6030"/>
+                <v:stroke color="#3465a4" joinstyle="round" endcap="flat"/>
+                <w10:wrap type="none"/>
+              </v:rect>
+            </w:pict>
+          </mc:Fallback>
+        </mc:AlternateContent>
+        <mc:AlternateContent>
+          <mc:Choice Requires="wps">
+            <w:drawing>
+              <wp:anchor behindDoc="0" distT="0" distB="0" distL="0" distR="0" simplePos="0" locked="0" layoutInCell="0" allowOverlap="1" relativeHeight="32">
+                <wp:simplePos x="0" y="0"/>
+                <wp:positionH relativeFrom="column">
+                  <wp:align>right</wp:align>
+                </wp:positionH>
+                <wp:positionV relativeFrom="paragraph">
+                  <wp:posOffset>191770</wp:posOffset>
+                </wp:positionV>
+                <wp:extent cx="257175" cy="257175"/>
+                <wp:effectExtent l="1270" t="1270" r="0" b="0"/>
+                <wp:wrapNone/>
+                <wp:docPr id="17" name="Shape 4"/>
+                <a:graphic xmlns:a="http://schemas.openxmlformats.org/drawingml/2006/main">
+                  <a:graphicData uri="http://schemas.microsoft.com/office/word/2010/wordprocessingShape">
+                    <wps:wsp>
+                      <wps:cNvSpPr/>
+                      <wps:spPr>
+                        <a:xfrm>
+                          <a:off x="0" y="0"/>
+                          <a:ext cx="257040" cy="257040"/>
+                        </a:xfrm>
+                        <a:prstGeom prst="rect">
+                          <a:avLst/>
+                        </a:prstGeom>
+                        <a:solidFill>
+                          <a:srgbClr val="729fcf"/>
+                        </a:solidFill>
+                        <a:ln w="0">
+                          <a:solidFill>
+                            <a:srgbClr val="3465a4"/>
+                          </a:solidFill>
+                        </a:ln>
+                      </wps:spPr>
+                      <wps:style>
+                        <a:lnRef idx="0"/>
+                        <a:fillRef idx="0"/>
+                        <a:effectRef idx="0"/>
+                        <a:fontRef idx="minor"/>
+                      </wps:style>
+                      <wps:bodyPr/>
+                    </wps:wsp>
+                  </a:graphicData>
+                </a:graphic>
+              </wp:anchor>
+            </w:drawing>
+          </mc:Choice>
+          <mc:Fallback>
+            <w:pict>
+              <v:rect id="shape_0" ID="Shape 4" fillcolor="#729fcf" stroked="t" o:allowincell="f" style="position:absolute;margin-left:478.3pt;margin-top:15.1pt;width:20.2pt;height:20.2pt;mso-wrap-style:none;v-text-anchor:middle;mso-position-horizontal:right">
+                <v:fill o:detectmouseclick="t" color2="#8d6030"/>
+                <v:stroke color="#3465a4" joinstyle="round" endcap="flat"/>
+                <w10:wrap type="none"/>
+              </v:rect>
+            </w:pict>
+          </mc:Fallback>
+        </mc:AlternateContent>
+        <mc:AlternateContent>
+          <mc:Choice Requires="wps">
+            <w:drawing>
+              <wp:anchor behindDoc="0" distT="0" distB="0" distL="0" distR="0" simplePos="0" locked="0" layoutInCell="0" allowOverlap="1" relativeHeight="33">
+                <wp:simplePos x="0" y="0"/>
+                <wp:positionH relativeFrom="column">
+                  <wp:align>center</wp:align>
+                </wp:positionH>
+                <wp:positionV relativeFrom="paragraph">
+                  <wp:posOffset>182245</wp:posOffset>
+                </wp:positionV>
+                <wp:extent cx="257175" cy="257175"/>
+                <wp:effectExtent l="1270" t="1270" r="0" b="0"/>
+                <wp:wrapNone/>
+                <wp:docPr id="18" name="Shape 5"/>
+                <a:graphic xmlns:a="http://schemas.openxmlformats.org/drawingml/2006/main">
+                  <a:graphicData uri="http://schemas.microsoft.com/office/word/2010/wordprocessingShape">
+                    <wps:wsp>
+                      <wps:cNvSpPr/>
+                      <wps:spPr>
+                        <a:xfrm>
+                          <a:off x="0" y="0"/>
+                          <a:ext cx="257040" cy="257040"/>
+                        </a:xfrm>
+                        <a:prstGeom prst="rect">
+                          <a:avLst/>
+                        </a:prstGeom>
+                        <a:solidFill>
+                          <a:srgbClr val="729fcf"/>
+                        </a:solidFill>
+                        <a:ln w="0">
+                          <a:solidFill>
+                            <a:srgbClr val="3465a4"/>
+                          </a:solidFill>
+                        </a:ln>
+                      </wps:spPr>
+                      <wps:style>
+                        <a:lnRef idx="0"/>
+                        <a:fillRef idx="0"/>
+                        <a:effectRef idx="0"/>
+                        <a:fontRef idx="minor"/>
+                      </wps:style>
+                      <wps:bodyPr/>
+                    </wps:wsp>
+                  </a:graphicData>
+                </a:graphic>
+              </wp:anchor>
+            </w:drawing>
+          </mc:Choice>
+          <mc:Fallback>
+            <w:pict>
+              <v:rect id="shape_0" ID="Shape 5" fillcolor="#729fcf" stroked="t" o:allowincell="f" style="position:absolute;margin-left:239.15pt;margin-top:14.35pt;width:20.2pt;height:20.2pt;mso-wrap-style:none;v-text-anchor:middle;mso-position-horizontal:center">
+                <v:fill o:detectmouseclick="t" color2="#8d6030"/>
+                <v:stroke color="#3465a4" joinstyle="round" endcap="flat"/>
+                <w10:wrap type="none"/>
+              </v:rect>
+            </w:pict>
+          </mc:Fallback>
+        </mc:AlternateContent>
+        <mc:AlternateContent>
+          <mc:Choice Requires="wps">
+            <w:drawing>
+              <wp:anchor behindDoc="0" distT="0" distB="0" distL="0" distR="0" simplePos="0" locked="0" layoutInCell="0" allowOverlap="1" relativeHeight="34">
+                <wp:simplePos x="0" y="0"/>
+                <wp:positionH relativeFrom="column">
+                  <wp:posOffset>108585</wp:posOffset>
+                </wp:positionH>
+                <wp:positionV relativeFrom="paragraph">
+                  <wp:posOffset>353060</wp:posOffset>
+                </wp:positionV>
+                <wp:extent cx="3057525" cy="2352675"/>
+                <wp:effectExtent l="635" t="635" r="635" b="635"/>
+                <wp:wrapNone/>
+                <wp:docPr id="19" name="Line 4"/>
+                <a:graphic xmlns:a="http://schemas.openxmlformats.org/drawingml/2006/main">
+                  <a:graphicData uri="http://schemas.microsoft.com/office/word/2010/wordprocessingShape">
+                    <wps:wsp>
+                      <wps:cNvSpPr/>
+                      <wps:spPr>
+                        <a:xfrm>
+                          <a:off x="0" y="0"/>
+                          <a:ext cx="3057480" cy="2352600"/>
+                        </a:xfrm>
+                        <a:prstGeom prst="line">
+                          <a:avLst/>
+                        </a:prstGeom>
+                        <a:ln w="0">
+                          <a:solidFill>
+                            <a:srgbClr val="000000"/>
+                          </a:solidFill>
+                        </a:ln>
+                      </wps:spPr>
+                      <wps:style>
+                        <a:lnRef idx="0"/>
+                        <a:fillRef idx="0"/>
+                        <a:effectRef idx="0"/>
+                        <a:fontRef idx="minor"/>
+                      </wps:style>
+                      <wps:bodyPr/>
+                    </wps:wsp>
+                  </a:graphicData>
+                </a:graphic>
+              </wp:anchor>
+            </w:drawing>
+          </mc:Choice>
+          <mc:Fallback>
+            <w:pict>
+              <v:line id="shape_0" from="8.55pt,27.8pt" to="249.25pt,213pt" ID="Line 4" stroked="t" o:allowincell="f" style="position:absolute">
+                <v:stroke color="black" joinstyle="round" endcap="flat"/>
+                <v:fill o:detectmouseclick="t" on="false"/>
+                <w10:wrap type="none"/>
+              </v:line>
+            </w:pict>
+          </mc:Fallback>
+        </mc:AlternateContent>
+        <mc:AlternateContent>
+          <mc:Choice Requires="wps">
+            <w:drawing>
+              <wp:anchor behindDoc="0" distT="0" distB="0" distL="0" distR="0" simplePos="0" locked="0" layoutInCell="0" allowOverlap="1" relativeHeight="35">
+                <wp:simplePos x="0" y="0"/>
+                <wp:positionH relativeFrom="column">
+                  <wp:posOffset>3166110</wp:posOffset>
+                </wp:positionH>
+                <wp:positionV relativeFrom="paragraph">
+                  <wp:posOffset>353060</wp:posOffset>
+                </wp:positionV>
+                <wp:extent cx="0" cy="2352675"/>
+                <wp:effectExtent l="635" t="635" r="635" b="635"/>
+                <wp:wrapNone/>
+                <wp:docPr id="20" name="Line 5"/>
+                <a:graphic xmlns:a="http://schemas.openxmlformats.org/drawingml/2006/main">
+                  <a:graphicData uri="http://schemas.microsoft.com/office/word/2010/wordprocessingShape">
+                    <wps:wsp>
+                      <wps:cNvSpPr/>
+                      <wps:spPr>
+                        <a:xfrm>
+                          <a:off x="0" y="0"/>
+                          <a:ext cx="0" cy="2352600"/>
+                        </a:xfrm>
+                        <a:prstGeom prst="line">
+                          <a:avLst/>
+                        </a:prstGeom>
+                        <a:ln w="0">
+                          <a:solidFill>
+                            <a:srgbClr val="000000"/>
+                          </a:solidFill>
+                        </a:ln>
+                      </wps:spPr>
+                      <wps:style>
+                        <a:lnRef idx="0"/>
+                        <a:fillRef idx="0"/>
+                        <a:effectRef idx="0"/>
+                        <a:fontRef idx="minor"/>
+                      </wps:style>
+                      <wps:bodyPr/>
+                    </wps:wsp>
+                  </a:graphicData>
+                </a:graphic>
+              </wp:anchor>
+            </w:drawing>
+          </mc:Choice>
+          <mc:Fallback>
+            <w:pict>
+              <v:line id="shape_0" from="249.3pt,27.8pt" to="249.3pt,213pt" ID="Line 5" stroked="t" o:allowincell="f" style="position:absolute">
+                <v:stroke color="black" joinstyle="round" endcap="flat"/>
+                <v:fill o:detectmouseclick="t" on="false"/>
+                <w10:wrap type="none"/>
+              </v:line>
+            </w:pict>
+          </mc:Fallback>
+        </mc:AlternateContent>
+        <mc:AlternateContent>
+          <mc:Choice Requires="wps">
+            <w:drawing>
+              <wp:anchor behindDoc="0" distT="0" distB="0" distL="0" distR="0" simplePos="0" locked="0" layoutInCell="0" allowOverlap="1" relativeHeight="36">
+                <wp:simplePos x="0" y="0"/>
+                <wp:positionH relativeFrom="column">
+                  <wp:posOffset>3166110</wp:posOffset>
+                </wp:positionH>
+                <wp:positionV relativeFrom="paragraph">
+                  <wp:posOffset>324485</wp:posOffset>
+                </wp:positionV>
+                <wp:extent cx="3019425" cy="2381250"/>
+                <wp:effectExtent l="635" t="635" r="635" b="635"/>
+                <wp:wrapNone/>
+                <wp:docPr id="21" name="Line 6"/>
+                <a:graphic xmlns:a="http://schemas.openxmlformats.org/drawingml/2006/main">
+                  <a:graphicData uri="http://schemas.microsoft.com/office/word/2010/wordprocessingShape">
+                    <wps:wsp>
+                      <wps:cNvSpPr/>
+                      <wps:spPr>
+                        <a:xfrm flipH="1">
+                          <a:off x="0" y="0"/>
+                          <a:ext cx="3019320" cy="2381400"/>
+                        </a:xfrm>
+                        <a:prstGeom prst="line">
+                          <a:avLst/>
+                        </a:prstGeom>
+                        <a:ln w="0">
+                          <a:solidFill>
+                            <a:srgbClr val="000000"/>
+                          </a:solidFill>
+                        </a:ln>
+                      </wps:spPr>
+                      <wps:style>
+                        <a:lnRef idx="0"/>
+                        <a:fillRef idx="0"/>
+                        <a:effectRef idx="0"/>
+                        <a:fontRef idx="minor"/>
+                      </wps:style>
+                      <wps:bodyPr/>
+                    </wps:wsp>
+                  </a:graphicData>
+                </a:graphic>
+              </wp:anchor>
+            </w:drawing>
+          </mc:Choice>
+          <mc:Fallback>
+            <w:pict>
+              <v:line id="shape_0" from="249.3pt,25.55pt" to="487pt,213pt" ID="Line 6" stroked="t" o:allowincell="f" style="position:absolute;flip:x">
+                <v:stroke color="black" joinstyle="round" endcap="flat"/>
+                <v:fill o:detectmouseclick="t" on="false"/>
+                <w10:wrap type="none"/>
+              </v:line>
+            </w:pict>
+          </mc:Fallback>
+        </mc:AlternateContent>
+        <mc:AlternateContent>
+          <mc:Choice Requires="wps">
+            <w:drawing>
+              <wp:anchor behindDoc="0" distT="0" distB="0" distL="0" distR="0" simplePos="0" locked="0" layoutInCell="0" allowOverlap="1" relativeHeight="37">
+                <wp:simplePos x="0" y="0"/>
+                <wp:positionH relativeFrom="column">
+                  <wp:posOffset>108585</wp:posOffset>
+                </wp:positionH>
+                <wp:positionV relativeFrom="paragraph">
+                  <wp:posOffset>324485</wp:posOffset>
+                </wp:positionV>
+                <wp:extent cx="6076950" cy="28575"/>
+                <wp:effectExtent l="635" t="635" r="635" b="635"/>
+                <wp:wrapNone/>
+                <wp:docPr id="22" name="Line 7"/>
+                <a:graphic xmlns:a="http://schemas.openxmlformats.org/drawingml/2006/main">
+                  <a:graphicData uri="http://schemas.microsoft.com/office/word/2010/wordprocessingShape">
+                    <wps:wsp>
+                      <wps:cNvSpPr/>
+                      <wps:spPr>
+                        <a:xfrm flipV="1">
+                          <a:off x="0" y="0"/>
+                          <a:ext cx="6076800" cy="28440"/>
+                        </a:xfrm>
+                        <a:prstGeom prst="line">
+                          <a:avLst/>
+                        </a:prstGeom>
+                        <a:ln cap="rnd" w="0">
+                          <a:solidFill>
+                            <a:srgbClr val="000000"/>
+                          </a:solidFill>
+                          <a:prstDash val="lgDash"/>
+                        </a:ln>
+                      </wps:spPr>
+                      <wps:style>
+                        <a:lnRef idx="0"/>
+                        <a:fillRef idx="0"/>
+                        <a:effectRef idx="0"/>
+                        <a:fontRef idx="minor"/>
+                      </wps:style>
+                      <wps:bodyPr/>
+                    </wps:wsp>
+                  </a:graphicData>
+                </a:graphic>
+              </wp:anchor>
+            </w:drawing>
+          </mc:Choice>
+          <mc:Fallback>
+            <w:pict>
+              <v:line id="shape_0" from="8.55pt,25.55pt" to="487pt,27.75pt" ID="Line 7" stroked="t" o:allowincell="f" style="position:absolute;flip:y">
+                <v:stroke color="black" dashstyle="longdash" joinstyle="round" endcap="round"/>
+                <v:fill o:detectmouseclick="t" on="false"/>
+                <w10:wrap type="none"/>
+              </v:line>
+            </w:pict>
+          </mc:Fallback>
+        </mc:AlternateContent>
+        <mc:AlternateContent>
+          <mc:Choice Requires="wps">
+            <w:drawing>
+              <wp:anchor behindDoc="0" distT="0" distB="0" distL="0" distR="0" simplePos="0" locked="0" layoutInCell="0" allowOverlap="1" relativeHeight="39">
+                <wp:simplePos x="0" y="0"/>
+                <wp:positionH relativeFrom="column">
+                  <wp:posOffset>3051810</wp:posOffset>
+                </wp:positionH>
+                <wp:positionV relativeFrom="paragraph">
+                  <wp:posOffset>-98425</wp:posOffset>
+                </wp:positionV>
+                <wp:extent cx="200025" cy="180975"/>
+                <wp:effectExtent l="0" t="0" r="0" b="0"/>
+                <wp:wrapNone/>
+                <wp:docPr id="23" name="Text Frame 8"/>
+                <a:graphic xmlns:a="http://schemas.openxmlformats.org/drawingml/2006/main">
+                  <a:graphicData uri="http://schemas.microsoft.com/office/word/2010/wordprocessingShape">
+                    <wps:wsp>
+                      <wps:cNvSpPr txBox="1"/>
+                      <wps:spPr>
+                        <a:xfrm>
+                          <a:off x="0" y="0"/>
+                          <a:ext cx="200160" cy="181080"/>
+                        </a:xfrm>
+                        <a:prstGeom prst="rect">
+                          <a:avLst/>
+                        </a:prstGeom>
+                        <a:noFill/>
+                        <a:ln w="0">
+                          <a:noFill/>
+                        </a:ln>
+                      </wps:spPr>
+                      <wps:txbx>
+                        <w:txbxContent>
+                          <w:p>
+                            <w:pPr>
+                              <w:overflowPunct w:val="false"/>
+                              <w:spacing w:before="0" w:after="0" w:lineRule="auto" w:line="240"/>
+                              <w:rPr/>
+                            </w:pPr>
+                            <w:r>
+                              <w:rPr>
+                                <w:sz w:val="22"/>
+                                <w:rFonts w:ascii="Cambria" w:hAnsi="Cambria" w:eastAsia="ＭＳ 明朝" w:asciiTheme="minorHAnsi" w:cstheme="minorBidi" w:eastAsiaTheme="minorEastAsia" w:hAnsiTheme="minorHAnsi"/>
+                              </w:rPr>
+                              <w:t>z</w:t>
+                            </w:r>
+                            <w:r>
+                              <w:rPr>
+                                <w:sz w:val="22"/>
+                                <w:vertAlign w:val="subscript"/>
+                                <w:rFonts w:ascii="Cambria" w:hAnsi="Cambria" w:eastAsia="ＭＳ 明朝" w:asciiTheme="minorHAnsi" w:cstheme="minorBidi" w:eastAsiaTheme="minorEastAsia" w:hAnsiTheme="minorHAnsi"/>
+                              </w:rPr>
+                              <w:t>i</w:t>
+                            </w:r>
+                          </w:p>
+                        </w:txbxContent>
+                      </wps:txbx>
+                      <wps:bodyPr wrap="square" lIns="0" rIns="0" tIns="0" bIns="0" anchor="t">
+                        <a:noAutofit/>
+                      </wps:bodyPr>
+                    </wps:wsp>
+                  </a:graphicData>
+                </a:graphic>
+              </wp:anchor>
+            </w:drawing>
+          </mc:Choice>
+          <mc:Fallback>
+            <w:pict>
+              <v:shape id="shape_0" ID="Text Frame 8" stroked="f" o:allowincell="f" style="position:absolute;margin-left:240.3pt;margin-top:-7.75pt;width:15.7pt;height:14.2pt;mso-wrap-style:square;v-text-anchor:top" type="_x0000_t202">
+                <v:textbox>
+                  <w:txbxContent>
+                    <w:p>
+                      <w:pPr>
+                        <w:overflowPunct w:val="false"/>
+                        <w:spacing w:before="0" w:after="0" w:lineRule="auto" w:line="240"/>
+                        <w:rPr/>
+                      </w:pPr>
+                      <w:r>
+                        <w:rPr>
+                          <w:sz w:val="22"/>
+                          <w:rFonts w:ascii="Cambria" w:hAnsi="Cambria" w:eastAsia="ＭＳ 明朝" w:asciiTheme="minorHAnsi" w:cstheme="minorBidi" w:eastAsiaTheme="minorEastAsia" w:hAnsiTheme="minorHAnsi"/>
+                        </w:rPr>
+                        <w:t>z</w:t>
+                      </w:r>
+                      <w:r>
+                        <w:rPr>
+                          <w:sz w:val="22"/>
+                          <w:vertAlign w:val="subscript"/>
+                          <w:rFonts w:ascii="Cambria" w:hAnsi="Cambria" w:eastAsia="ＭＳ 明朝" w:asciiTheme="minorHAnsi" w:cstheme="minorBidi" w:eastAsiaTheme="minorEastAsia" w:hAnsiTheme="minorHAnsi"/>
+                        </w:rPr>
+                        <w:t>i</w:t>
+                      </w:r>
+                    </w:p>
+                  </w:txbxContent>
+                </v:textbox>
+                <v:fill o:detectmouseclick="t" on="false"/>
+                <v:stroke color="black" joinstyle="round" endcap="round"/>
+                <w10:wrap type="none"/>
+              </v:shape>
+            </w:pict>
+          </mc:Fallback>
+        </mc:AlternateContent>
+      </w:r>
+    </w:p>
+    <w:p>
+      <w:pPr>
+        <w:pStyle w:val="Normal"/>
+        <w:spacing w:before="0" w:after="200"/>
+        <w:ind w:hanging="0"/>
+        <w:jc w:val="left"/>
+        <w:rPr>
+          <w:rFonts w:ascii="Arial" w:hAnsi="Arial" w:eastAsia="Arial" w:cs="" w:cstheme="minorBidi"/>
+          <w:color w:val="auto"/>
+          <w:kern w:val="0"/>
+          <w:sz w:val="24"/>
+          <w:szCs w:val="22"/>
+          <w:lang w:val="en-US" w:eastAsia="en-US" w:bidi="ar-SA"/>
+        </w:rPr>
+      </w:pPr>
+      <w:r>
+        <w:rPr/>
+      </w:r>
+    </w:p>
+    <w:p>
+      <w:pPr>
+        <w:pStyle w:val="Normal"/>
+        <w:spacing w:before="0" w:after="200"/>
+        <w:ind w:hanging="0"/>
+        <w:jc w:val="left"/>
+        <w:rPr>
+          <w:rFonts w:ascii="Arial" w:hAnsi="Arial" w:eastAsia="Arial" w:cs="" w:cstheme="minorBidi"/>
+          <w:color w:val="auto"/>
+          <w:kern w:val="0"/>
+          <w:sz w:val="24"/>
+          <w:szCs w:val="22"/>
+          <w:lang w:val="en-US" w:eastAsia="en-US" w:bidi="ar-SA"/>
+        </w:rPr>
+      </w:pPr>
+      <w:r>
+        <w:rPr/>
+      </w:r>
+    </w:p>
+    <w:p>
+      <w:pPr>
+        <w:pStyle w:val="Normal"/>
+        <w:spacing w:before="0" w:after="200"/>
+        <w:ind w:hanging="0"/>
+        <w:jc w:val="left"/>
+        <w:rPr>
+          <w:rFonts w:ascii="Arial" w:hAnsi="Arial" w:eastAsia="Arial" w:cs="" w:cstheme="minorBidi"/>
+          <w:color w:val="auto"/>
+          <w:kern w:val="0"/>
+          <w:sz w:val="24"/>
+          <w:szCs w:val="22"/>
+          <w:lang w:val="en-US" w:eastAsia="en-US" w:bidi="ar-SA"/>
+        </w:rPr>
+      </w:pPr>
+      <w:r>
+        <w:rPr/>
+      </w:r>
+    </w:p>
+    <w:p>
+      <w:pPr>
+        <w:pStyle w:val="Normal"/>
+        <w:spacing w:before="0" w:after="200"/>
+        <w:ind w:hanging="0"/>
+        <w:jc w:val="left"/>
+        <w:rPr>
+          <w:rFonts w:ascii="Arial" w:hAnsi="Arial" w:eastAsia="Arial" w:cs="" w:cstheme="minorBidi"/>
+          <w:color w:val="auto"/>
+          <w:kern w:val="0"/>
+          <w:sz w:val="24"/>
+          <w:szCs w:val="22"/>
+          <w:lang w:val="en-US" w:eastAsia="en-US" w:bidi="ar-SA"/>
+        </w:rPr>
+      </w:pPr>
+      <w:r>
+        <w:rPr/>
+      </w:r>
+    </w:p>
+    <w:p>
+      <w:pPr>
+        <w:pStyle w:val="Normal"/>
+        <w:spacing w:before="0" w:after="200"/>
+        <w:ind w:hanging="0"/>
+        <w:jc w:val="left"/>
+        <w:rPr>
+          <w:rFonts w:ascii="Arial" w:hAnsi="Arial" w:eastAsia="Arial" w:cs="" w:cstheme="minorBidi"/>
+          <w:color w:val="auto"/>
+          <w:kern w:val="0"/>
+          <w:sz w:val="24"/>
+          <w:szCs w:val="22"/>
+          <w:lang w:val="en-US" w:eastAsia="en-US" w:bidi="ar-SA"/>
+        </w:rPr>
+      </w:pPr>
+      <w:r>
+        <w:rPr/>
+        <mc:AlternateContent>
+          <mc:Choice Requires="wps">
+            <w:drawing>
+              <wp:anchor behindDoc="0" distT="0" distB="0" distL="0" distR="0" simplePos="0" locked="0" layoutInCell="0" allowOverlap="1" relativeHeight="28">
+                <wp:simplePos x="0" y="0"/>
+                <wp:positionH relativeFrom="column">
+                  <wp:posOffset>4756785</wp:posOffset>
+                </wp:positionH>
+                <wp:positionV relativeFrom="paragraph">
+                  <wp:posOffset>-97155</wp:posOffset>
+                </wp:positionV>
+                <wp:extent cx="371475" cy="194945"/>
+                <wp:effectExtent l="0" t="0" r="0" b="0"/>
+                <wp:wrapNone/>
+                <wp:docPr id="24" name="Text Frame 6"/>
+                <a:graphic xmlns:a="http://schemas.openxmlformats.org/drawingml/2006/main">
+                  <a:graphicData uri="http://schemas.microsoft.com/office/word/2010/wordprocessingShape">
+                    <wps:wsp>
+                      <wps:cNvSpPr txBox="1"/>
+                      <wps:spPr>
+                        <a:xfrm>
+                          <a:off x="0" y="0"/>
+                          <a:ext cx="371520" cy="195120"/>
+                        </a:xfrm>
+                        <a:prstGeom prst="rect">
+                          <a:avLst/>
+                        </a:prstGeom>
+                        <a:noFill/>
+                        <a:ln w="0">
+                          <a:noFill/>
+                        </a:ln>
+                      </wps:spPr>
+                      <wps:txbx>
+                        <w:txbxContent>
+                          <w:p>
+                            <w:pPr>
+                              <w:overflowPunct w:val="false"/>
+                              <w:spacing w:before="0" w:after="0" w:lineRule="auto" w:line="240"/>
+                              <w:rPr/>
+                            </w:pPr>
+                            <w:r>
+                              <w:rPr>
+                                <w:sz w:val="22"/>
+                                <w:rFonts w:ascii="Cambria" w:hAnsi="Cambria" w:eastAsia="ＭＳ 明朝" w:asciiTheme="minorHAnsi" w:cstheme="minorBidi" w:eastAsiaTheme="minorEastAsia" w:hAnsiTheme="minorHAnsi"/>
+                              </w:rPr>
+                              <w:t>R</w:t>
+                            </w:r>
+                            <w:r>
+                              <w:rPr>
+                                <w:sz w:val="22"/>
+                                <w:vertAlign w:val="subscript"/>
+                                <w:rFonts w:ascii="Cambria" w:hAnsi="Cambria" w:eastAsia="ＭＳ 明朝" w:asciiTheme="minorHAnsi" w:cstheme="minorBidi" w:eastAsiaTheme="minorEastAsia" w:hAnsiTheme="minorHAnsi"/>
+                              </w:rPr>
+                              <w:t>i+1</w:t>
+                            </w:r>
+                          </w:p>
+                        </w:txbxContent>
+                      </wps:txbx>
+                      <wps:bodyPr wrap="square" lIns="0" rIns="0" tIns="0" bIns="0" anchor="t">
+                        <a:noAutofit/>
+                      </wps:bodyPr>
+                    </wps:wsp>
+                  </a:graphicData>
+                </a:graphic>
+              </wp:anchor>
+            </w:drawing>
+          </mc:Choice>
+          <mc:Fallback>
+            <w:pict>
+              <v:shape id="shape_0" ID="Text Frame 6" stroked="f" o:allowincell="f" style="position:absolute;margin-left:374.55pt;margin-top:-7.65pt;width:29.2pt;height:15.3pt;mso-wrap-style:square;v-text-anchor:top" type="_x0000_t202">
+                <v:textbox>
+                  <w:txbxContent>
+                    <w:p>
+                      <w:pPr>
+                        <w:overflowPunct w:val="false"/>
+                        <w:spacing w:before="0" w:after="0" w:lineRule="auto" w:line="240"/>
+                        <w:rPr/>
+                      </w:pPr>
+                      <w:r>
+                        <w:rPr>
+                          <w:sz w:val="22"/>
+                          <w:rFonts w:ascii="Cambria" w:hAnsi="Cambria" w:eastAsia="ＭＳ 明朝" w:asciiTheme="minorHAnsi" w:cstheme="minorBidi" w:eastAsiaTheme="minorEastAsia" w:hAnsiTheme="minorHAnsi"/>
+                        </w:rPr>
+                        <w:t>R</w:t>
+                      </w:r>
+                      <w:r>
+                        <w:rPr>
+                          <w:sz w:val="22"/>
+                          <w:vertAlign w:val="subscript"/>
+                          <w:rFonts w:ascii="Cambria" w:hAnsi="Cambria" w:eastAsia="ＭＳ 明朝" w:asciiTheme="minorHAnsi" w:cstheme="minorBidi" w:eastAsiaTheme="minorEastAsia" w:hAnsiTheme="minorHAnsi"/>
+                        </w:rPr>
+                        <w:t>i+1</w:t>
+                      </w:r>
+                    </w:p>
+                  </w:txbxContent>
+                </v:textbox>
+                <v:fill o:detectmouseclick="t" on="false"/>
+                <v:stroke color="black" joinstyle="round" endcap="round"/>
+                <w10:wrap type="none"/>
+              </v:shape>
+            </w:pict>
+          </mc:Fallback>
+        </mc:AlternateContent>
+        <mc:AlternateContent>
+          <mc:Choice Requires="wps">
+            <w:drawing>
+              <wp:anchor behindDoc="0" distT="0" distB="0" distL="0" distR="0" simplePos="0" locked="0" layoutInCell="0" allowOverlap="1" relativeHeight="29">
+                <wp:simplePos x="0" y="0"/>
+                <wp:positionH relativeFrom="column">
+                  <wp:posOffset>1270635</wp:posOffset>
+                </wp:positionH>
+                <wp:positionV relativeFrom="paragraph">
+                  <wp:posOffset>-68580</wp:posOffset>
+                </wp:positionV>
+                <wp:extent cx="285750" cy="180975"/>
+                <wp:effectExtent l="0" t="0" r="0" b="0"/>
+                <wp:wrapNone/>
+                <wp:docPr id="25" name="Text Frame 7"/>
+                <a:graphic xmlns:a="http://schemas.openxmlformats.org/drawingml/2006/main">
+                  <a:graphicData uri="http://schemas.microsoft.com/office/word/2010/wordprocessingShape">
+                    <wps:wsp>
+                      <wps:cNvSpPr txBox="1"/>
+                      <wps:spPr>
+                        <a:xfrm>
+                          <a:off x="0" y="0"/>
+                          <a:ext cx="285840" cy="181080"/>
+                        </a:xfrm>
+                        <a:prstGeom prst="rect">
+                          <a:avLst/>
+                        </a:prstGeom>
+                        <a:noFill/>
+                        <a:ln w="0">
+                          <a:noFill/>
+                        </a:ln>
+                      </wps:spPr>
+                      <wps:txbx>
+                        <w:txbxContent>
+                          <w:p>
+                            <w:pPr>
+                              <w:overflowPunct w:val="false"/>
+                              <w:spacing w:before="0" w:after="0" w:lineRule="auto" w:line="240"/>
+                              <w:rPr/>
+                            </w:pPr>
+                            <w:r>
+                              <w:rPr>
+                                <w:sz w:val="22"/>
+                                <w:rFonts w:ascii="Cambria" w:hAnsi="Cambria" w:eastAsia="ＭＳ 明朝" w:asciiTheme="minorHAnsi" w:cstheme="minorBidi" w:eastAsiaTheme="minorEastAsia" w:hAnsiTheme="minorHAnsi"/>
+                              </w:rPr>
+                              <w:t>R</w:t>
+                            </w:r>
+                            <w:r>
+                              <w:rPr>
+                                <w:sz w:val="22"/>
+                                <w:vertAlign w:val="subscript"/>
+                                <w:rFonts w:ascii="Cambria" w:hAnsi="Cambria" w:eastAsia="ＭＳ 明朝" w:asciiTheme="minorHAnsi" w:cstheme="minorBidi" w:eastAsiaTheme="minorEastAsia" w:hAnsiTheme="minorHAnsi"/>
+                              </w:rPr>
+                              <w:t>i-1</w:t>
+                            </w:r>
+                          </w:p>
+                        </w:txbxContent>
+                      </wps:txbx>
+                      <wps:bodyPr wrap="square" lIns="0" rIns="0" tIns="0" bIns="0" anchor="t">
+                        <a:noAutofit/>
+                      </wps:bodyPr>
+                    </wps:wsp>
+                  </a:graphicData>
+                </a:graphic>
+              </wp:anchor>
+            </w:drawing>
+          </mc:Choice>
+          <mc:Fallback>
+            <w:pict>
+              <v:shape id="shape_0" ID="Text Frame 7" stroked="f" o:allowincell="f" style="position:absolute;margin-left:100.05pt;margin-top:-5.4pt;width:22.45pt;height:14.2pt;mso-wrap-style:square;v-text-anchor:top" type="_x0000_t202">
+                <v:textbox>
+                  <w:txbxContent>
+                    <w:p>
+                      <w:pPr>
+                        <w:overflowPunct w:val="false"/>
+                        <w:spacing w:before="0" w:after="0" w:lineRule="auto" w:line="240"/>
+                        <w:rPr/>
+                      </w:pPr>
+                      <w:r>
+                        <w:rPr>
+                          <w:sz w:val="22"/>
+                          <w:rFonts w:ascii="Cambria" w:hAnsi="Cambria" w:eastAsia="ＭＳ 明朝" w:asciiTheme="minorHAnsi" w:cstheme="minorBidi" w:eastAsiaTheme="minorEastAsia" w:hAnsiTheme="minorHAnsi"/>
+                        </w:rPr>
+                        <w:t>R</w:t>
+                      </w:r>
+                      <w:r>
+                        <w:rPr>
+                          <w:sz w:val="22"/>
+                          <w:vertAlign w:val="subscript"/>
+                          <w:rFonts w:ascii="Cambria" w:hAnsi="Cambria" w:eastAsia="ＭＳ 明朝" w:asciiTheme="minorHAnsi" w:cstheme="minorBidi" w:eastAsiaTheme="minorEastAsia" w:hAnsiTheme="minorHAnsi"/>
+                        </w:rPr>
+                        <w:t>i-1</w:t>
+                      </w:r>
+                    </w:p>
+                  </w:txbxContent>
+                </v:textbox>
+                <v:fill o:detectmouseclick="t" on="false"/>
+                <v:stroke color="black" joinstyle="round" endcap="round"/>
+                <w10:wrap type="none"/>
+              </v:shape>
+            </w:pict>
+          </mc:Fallback>
+        </mc:AlternateContent>
+      </w:r>
+    </w:p>
+    <w:p>
+      <w:pPr>
+        <w:pStyle w:val="Normal"/>
+        <w:spacing w:before="0" w:after="200"/>
+        <w:ind w:hanging="0"/>
+        <w:jc w:val="left"/>
+        <w:rPr>
+          <w:rFonts w:ascii="Arial" w:hAnsi="Arial" w:eastAsia="Arial" w:cs="" w:cstheme="minorBidi"/>
+          <w:color w:val="auto"/>
+          <w:kern w:val="0"/>
+          <w:sz w:val="24"/>
+          <w:szCs w:val="22"/>
+          <w:lang w:val="en-US" w:eastAsia="en-US" w:bidi="ar-SA"/>
+        </w:rPr>
+      </w:pPr>
+      <w:r>
+        <w:rPr/>
+      </w:r>
+    </w:p>
+    <w:p>
+      <w:pPr>
+        <w:pStyle w:val="Normal"/>
+        <w:spacing w:before="0" w:after="200"/>
+        <w:ind w:hanging="0"/>
+        <w:jc w:val="left"/>
+        <w:rPr>
+          <w:rFonts w:ascii="Arial" w:hAnsi="Arial" w:eastAsia="Arial" w:cs="" w:cstheme="minorBidi"/>
+          <w:color w:val="auto"/>
+          <w:kern w:val="0"/>
+          <w:sz w:val="24"/>
+          <w:szCs w:val="22"/>
+          <w:lang w:val="en-US" w:eastAsia="en-US" w:bidi="ar-SA"/>
+        </w:rPr>
+      </w:pPr>
+      <w:r>
+        <w:rPr/>
+      </w:r>
+    </w:p>
+    <w:p>
+      <w:pPr>
+        <w:pStyle w:val="Normal"/>
+        <w:spacing w:before="0" w:after="200"/>
+        <w:ind w:hanging="0"/>
+        <w:jc w:val="left"/>
+        <w:rPr>
+          <w:rFonts w:ascii="Arial" w:hAnsi="Arial" w:eastAsia="Arial" w:cs="" w:cstheme="minorBidi"/>
+          <w:color w:val="auto"/>
+          <w:kern w:val="0"/>
+          <w:sz w:val="24"/>
+          <w:szCs w:val="22"/>
+          <w:lang w:val="en-US" w:eastAsia="en-US" w:bidi="ar-SA"/>
+        </w:rPr>
+      </w:pPr>
+      <w:r>
+        <w:rPr/>
+      </w:r>
+    </w:p>
+    <w:p>
+      <w:pPr>
+        <w:pStyle w:val="Normal"/>
+        <w:spacing w:before="0" w:after="200"/>
+        <w:ind w:hanging="0"/>
+        <w:jc w:val="left"/>
+        <w:rPr>
+          <w:rFonts w:ascii="Arial" w:hAnsi="Arial" w:eastAsia="Arial" w:cs="" w:cstheme="minorBidi"/>
+          <w:color w:val="auto"/>
+          <w:kern w:val="0"/>
+          <w:sz w:val="24"/>
+          <w:szCs w:val="22"/>
+          <w:lang w:val="en-US" w:eastAsia="en-US" w:bidi="ar-SA"/>
+        </w:rPr>
+      </w:pPr>
+      <w:r>
+        <w:rPr/>
+      </w:r>
+    </w:p>
+    <w:p>
+      <w:pPr>
+        <w:pStyle w:val="Normal"/>
+        <w:spacing w:before="0" w:after="200"/>
+        <w:ind w:hanging="0"/>
+        <w:jc w:val="left"/>
+        <w:rPr>
+          <w:rFonts w:ascii="Arial" w:hAnsi="Arial" w:eastAsia="Arial" w:cs="" w:cstheme="minorBidi"/>
+          <w:color w:val="auto"/>
+          <w:kern w:val="0"/>
+          <w:sz w:val="24"/>
+          <w:szCs w:val="22"/>
+          <w:lang w:val="en-US" w:eastAsia="en-US" w:bidi="ar-SA"/>
+        </w:rPr>
+      </w:pPr>
+      <w:r>
+        <w:rPr/>
+      </w:r>
+    </w:p>
+    <w:p>
+      <w:pPr>
+        <w:pStyle w:val="Normal"/>
+        <w:spacing w:before="0" w:after="200"/>
+        <w:ind w:hanging="0"/>
+        <w:jc w:val="left"/>
+        <w:rPr>
+          <w:rFonts w:ascii="Arial" w:hAnsi="Arial" w:eastAsia="Arial" w:cs="" w:cstheme="minorBidi"/>
+          <w:color w:val="auto"/>
+          <w:kern w:val="0"/>
+          <w:sz w:val="24"/>
+          <w:szCs w:val="22"/>
+          <w:lang w:val="en-US" w:eastAsia="en-US" w:bidi="ar-SA"/>
+        </w:rPr>
+      </w:pPr>
+      <w:r>
+        <w:rPr/>
+      </w:r>
+    </w:p>
+    <w:p>
+      <w:pPr>
+        <w:pStyle w:val="Normal"/>
+        <w:spacing w:before="0" w:after="200"/>
+        <w:ind w:hanging="0"/>
+        <w:jc w:val="left"/>
+        <w:rPr>
+          <w:rFonts w:ascii="Arial" w:hAnsi="Arial" w:eastAsia="Arial" w:cs="" w:cstheme="minorBidi"/>
+          <w:color w:val="auto"/>
+          <w:kern w:val="0"/>
+          <w:sz w:val="24"/>
+          <w:szCs w:val="22"/>
+          <w:lang w:val="en-US" w:eastAsia="en-US" w:bidi="ar-SA"/>
+        </w:rPr>
+      </w:pPr>
+      <w:r>
+        <w:rPr/>
+      </w:r>
+    </w:p>
+    <w:p>
+      <w:pPr>
+        <w:pStyle w:val="Normal"/>
+        <w:spacing w:before="0" w:after="200"/>
+        <w:ind w:hanging="0"/>
+        <w:jc w:val="left"/>
+        <w:rPr>
+          <w:rFonts w:ascii="Arial" w:hAnsi="Arial" w:eastAsia="Arial" w:cs="" w:cstheme="minorBidi"/>
+          <w:color w:val="auto"/>
+          <w:kern w:val="0"/>
+          <w:sz w:val="24"/>
+          <w:szCs w:val="22"/>
+          <w:lang w:val="en-US" w:eastAsia="en-US" w:bidi="ar-SA"/>
+        </w:rPr>
+      </w:pPr>
+      <w:r>
+        <w:rPr/>
+      </w:r>
+    </w:p>
+    <w:p>
+      <w:pPr>
+        <w:pStyle w:val="Normal"/>
+        <w:spacing w:before="0" w:after="200"/>
+        <w:ind w:hanging="0"/>
+        <w:jc w:val="left"/>
+        <w:rPr/>
+      </w:pPr>
+      <w:r>
+        <w:rPr>
+          <w:rFonts w:eastAsia="Arial" w:cs="" w:cstheme="minorBidi"/>
+          <w:color w:val="auto"/>
+          <w:kern w:val="0"/>
+          <w:sz w:val="24"/>
+          <w:szCs w:val="22"/>
+          <w:lang w:val="en-US" w:eastAsia="en-US" w:bidi="ar-SA"/>
+        </w:rPr>
+        <w:t>Θ</w:t>
+      </w:r>
+      <w:r>
+        <w:rPr>
+          <w:rFonts w:eastAsia="Arial" w:cs="" w:cstheme="minorBidi"/>
+          <w:color w:val="auto"/>
+          <w:kern w:val="0"/>
+          <w:sz w:val="24"/>
+          <w:szCs w:val="22"/>
+          <w:lang w:val="en-US" w:eastAsia="en-US" w:bidi="ar-SA"/>
+        </w:rPr>
+        <w:t xml:space="preserve">εωρώντας την απόσταση D μεταξύ της βάσης του βραχίονα και του </w:t>
+      </w:r>
+      <w:r>
+        <w:rPr>
+          <w:rFonts w:eastAsia="Arial" w:cs="" w:cstheme="minorBidi"/>
+          <w:color w:val="auto"/>
+          <w:kern w:val="0"/>
+          <w:sz w:val="24"/>
+          <w:szCs w:val="22"/>
+          <w:lang w:val="en-US" w:eastAsia="en-US" w:bidi="ar-SA"/>
+        </w:rPr>
+        <w:t xml:space="preserve">αρχικού </w:t>
+      </w:r>
+      <w:r>
+        <w:rPr>
+          <w:rFonts w:eastAsia="Arial" w:cs="" w:cstheme="minorBidi"/>
+          <w:color w:val="auto"/>
+          <w:kern w:val="0"/>
+          <w:sz w:val="24"/>
+          <w:szCs w:val="22"/>
+          <w:lang w:val="en-US" w:eastAsia="en-US" w:bidi="ar-SA"/>
+        </w:rPr>
+        <w:t xml:space="preserve">σημείου Ε1 ή Ε8=(0, 1.53125) (αναλόγος με ποιο χρώμα τίθεται ο βραχίονας), </w:t>
+      </w:r>
+      <w:r>
+        <w:rPr>
+          <w:rFonts w:eastAsia="Arial" w:cs="" w:cstheme="minorBidi"/>
+          <w:color w:val="auto"/>
+          <w:kern w:val="0"/>
+          <w:sz w:val="24"/>
+          <w:szCs w:val="22"/>
+          <w:lang w:val="en-US" w:eastAsia="en-US" w:bidi="ar-SA"/>
+        </w:rPr>
+        <w:t>υπολογίζεται η υποτείνουσα:</w:t>
+      </w:r>
+    </w:p>
+    <w:p>
+      <w:pPr>
+        <w:pStyle w:val="Normal"/>
+        <w:spacing w:before="0" w:after="200"/>
+        <w:ind w:hanging="0"/>
+        <w:jc w:val="left"/>
+        <w:rPr/>
+      </w:pPr>
+      <w:r>
+        <w:rPr>
+          <w:rFonts w:eastAsia="Arial" w:cs="" w:cstheme="minorBidi"/>
+          <w:color w:val="auto"/>
+          <w:kern w:val="0"/>
+          <w:sz w:val="24"/>
+          <w:szCs w:val="22"/>
+          <w:lang w:val="en-US" w:eastAsia="en-US" w:bidi="ar-SA"/>
+        </w:rPr>
+        <w:t xml:space="preserve">                                                    </w:t>
+      </w:r>
+    </w:p>
+    <w:p>
+      <w:pPr>
+        <w:pStyle w:val="Normal"/>
+        <w:spacing w:before="0" w:after="200"/>
+        <w:ind w:hanging="0"/>
+        <w:jc w:val="left"/>
+        <w:rPr/>
+      </w:pPr>
+      <w:r>
+        <w:rPr>
+          <w:rFonts w:eastAsia="Arial" w:cs="" w:cstheme="minorBidi"/>
+          <w:color w:val="auto"/>
+          <w:kern w:val="0"/>
+          <w:sz w:val="24"/>
+          <w:szCs w:val="22"/>
+          <w:lang w:val="en-US" w:eastAsia="en-US" w:bidi="ar-SA"/>
+        </w:rPr>
+        <w:t xml:space="preserve">                                                       </w:t>
+      </w:r>
+      <w:r>
+        <w:rPr>
+          <w:rFonts w:eastAsia="Arial" w:cs="" w:cstheme="minorBidi"/>
+          <w:color w:val="auto"/>
+          <w:kern w:val="0"/>
+          <w:sz w:val="24"/>
+          <w:szCs w:val="22"/>
+          <w:lang w:val="en-US" w:eastAsia="en-US" w:bidi="ar-SA"/>
+        </w:rPr>
+      </w:r>
+      <m:oMath xmlns:m="http://schemas.openxmlformats.org/officeDocument/2006/math">
+        <m:sSub>
+          <m:e>
+            <m:r>
+              <w:rPr>
+                <w:rFonts w:ascii="Cambria Math" w:hAnsi="Cambria Math"/>
+              </w:rPr>
+              <m:t xml:space="preserve">R</m:t>
+            </m:r>
+          </m:e>
+          <m:sub>
+            <m:r>
+              <w:rPr>
+                <w:rFonts w:ascii="Cambria Math" w:hAnsi="Cambria Math"/>
+              </w:rPr>
+              <m:t xml:space="preserve">i</m:t>
+            </m:r>
+          </m:sub>
+        </m:sSub>
+        <m:r>
+          <w:rPr>
+            <w:rFonts w:ascii="Cambria Math" w:hAnsi="Cambria Math"/>
+          </w:rPr>
+          <m:t xml:space="preserve">=</m:t>
+        </m:r>
+        <m:rad>
+          <m:radPr>
+            <m:degHide m:val="1"/>
+          </m:radPr>
+          <m:deg/>
+          <m:e>
+            <m:sSup>
+              <m:e>
+                <m:r>
+                  <w:rPr>
+                    <w:rFonts w:ascii="Cambria Math" w:hAnsi="Cambria Math"/>
+                  </w:rPr>
+                  <m:t xml:space="preserve">D</m:t>
+                </m:r>
+              </m:e>
+              <m:sup>
+                <m:r>
+                  <w:rPr>
+                    <w:rFonts w:ascii="Cambria Math" w:hAnsi="Cambria Math"/>
+                  </w:rPr>
+                  <m:t xml:space="preserve">2</m:t>
+                </m:r>
+              </m:sup>
+            </m:sSup>
+            <m:r>
+              <w:rPr>
+                <w:rFonts w:ascii="Cambria Math" w:hAnsi="Cambria Math"/>
+              </w:rPr>
+              <m:t xml:space="preserve">+</m:t>
+            </m:r>
+            <m:sSubSup>
+              <m:e>
+                <m:r>
+                  <w:rPr>
+                    <w:rFonts w:ascii="Cambria Math" w:hAnsi="Cambria Math"/>
+                  </w:rPr>
+                  <m:t xml:space="preserve">z</m:t>
+                </m:r>
+              </m:e>
+              <m:sub>
+                <m:r>
+                  <w:rPr>
+                    <w:rFonts w:ascii="Cambria Math" w:hAnsi="Cambria Math"/>
+                  </w:rPr>
+                  <m:t xml:space="preserve">i</m:t>
+                </m:r>
+              </m:sub>
+              <m:sup>
+                <m:r>
+                  <w:rPr>
+                    <w:rFonts w:ascii="Cambria Math" w:hAnsi="Cambria Math"/>
+                  </w:rPr>
+                  <m:t xml:space="preserve">2</m:t>
+                </m:r>
+              </m:sup>
+            </m:sSubSup>
+          </m:e>
+        </m:rad>
+      </m:oMath>
+    </w:p>
+    <w:p>
+      <w:pPr>
+        <w:pStyle w:val="Normal"/>
+        <w:spacing w:before="0" w:after="200"/>
+        <w:ind w:hanging="0"/>
+        <w:jc w:val="left"/>
+        <w:rPr/>
+      </w:pPr>
+      <w:r>
+        <w:rPr>
+          <w:rFonts w:eastAsia="Arial" w:cs="" w:cstheme="minorBidi"/>
+          <w:color w:val="auto"/>
+          <w:kern w:val="0"/>
+          <w:sz w:val="24"/>
+          <w:szCs w:val="22"/>
+          <w:lang w:val="en-US" w:eastAsia="en-US" w:bidi="ar-SA"/>
+        </w:rPr>
+        <w:t>,ό</w:t>
+      </w:r>
+      <w:r>
+        <w:rPr>
+          <w:rFonts w:eastAsia="Arial" w:cs="" w:cstheme="minorBidi"/>
+          <w:color w:val="auto"/>
+          <w:kern w:val="0"/>
+          <w:sz w:val="24"/>
+          <w:szCs w:val="22"/>
+          <w:lang w:val="en-US" w:eastAsia="en-US" w:bidi="ar-SA"/>
+        </w:rPr>
+        <w:t xml:space="preserve">που </w:t>
+      </w:r>
+      <w:r>
+        <w:rPr>
+          <w:rFonts w:eastAsia="Arial" w:cs="" w:cstheme="minorBidi"/>
+          <w:color w:val="auto"/>
+          <w:kern w:val="0"/>
+          <w:sz w:val="28"/>
+          <w:szCs w:val="28"/>
+          <w:lang w:val="en-US" w:eastAsia="en-US" w:bidi="ar-SA"/>
+        </w:rPr>
+        <w:t>z</w:t>
+      </w:r>
+      <w:r>
+        <w:rPr>
+          <w:rFonts w:eastAsia="Arial" w:cs="" w:cstheme="minorBidi"/>
+          <w:color w:val="auto"/>
+          <w:kern w:val="0"/>
+          <w:sz w:val="28"/>
+          <w:szCs w:val="28"/>
+          <w:vertAlign w:val="subscript"/>
+          <w:lang w:val="en-US" w:eastAsia="en-US" w:bidi="ar-SA"/>
+        </w:rPr>
+        <w:t>i</w:t>
+      </w:r>
+      <w:r>
+        <w:rPr>
+          <w:rFonts w:eastAsia="Arial" w:cs="" w:cstheme="minorBidi"/>
+          <w:color w:val="auto"/>
+          <w:kern w:val="0"/>
+          <w:position w:val="0"/>
+          <w:sz w:val="24"/>
+          <w:sz w:val="24"/>
+          <w:szCs w:val="22"/>
+          <w:vertAlign w:val="baseline"/>
+          <w:lang w:val="en-US" w:eastAsia="en-US" w:bidi="ar-SA"/>
+        </w:rPr>
+        <w:t xml:space="preserve"> είναι η απόσταση μεταξύ των συντεταγμένων z του αρχικού σημείου και του ζητούμενου σημείου.</w:t>
+      </w:r>
+    </w:p>
+    <w:p>
+      <w:pPr>
+        <w:pStyle w:val="Normal"/>
+        <w:spacing w:before="0" w:after="200"/>
+        <w:ind w:hanging="0"/>
+        <w:jc w:val="left"/>
+        <w:rPr>
+          <w:rFonts w:ascii="Arial" w:hAnsi="Arial" w:eastAsia="Arial" w:cs="" w:cstheme="minorBidi"/>
+          <w:color w:val="auto"/>
+          <w:kern w:val="0"/>
+          <w:position w:val="0"/>
+          <w:sz w:val="24"/>
+          <w:sz w:val="24"/>
+          <w:szCs w:val="22"/>
+          <w:vertAlign w:val="baseline"/>
+          <w:lang w:val="en-US" w:eastAsia="en-US" w:bidi="ar-SA"/>
+        </w:rPr>
+      </w:pPr>
+      <w:r>
+        <w:rPr/>
+      </w:r>
+    </w:p>
+    <w:p>
+      <w:pPr>
+        <w:pStyle w:val="Normal"/>
+        <w:spacing w:before="0" w:after="200"/>
+        <w:ind w:hanging="0"/>
+        <w:jc w:val="left"/>
+        <w:rPr/>
+      </w:pPr>
+      <w:r>
+        <w:rPr>
+          <w:rFonts w:eastAsia="Arial" w:cs="" w:cstheme="minorBidi"/>
+          <w:color w:val="auto"/>
+          <w:kern w:val="0"/>
+          <w:position w:val="0"/>
+          <w:sz w:val="24"/>
+          <w:sz w:val="24"/>
+          <w:szCs w:val="22"/>
+          <w:vertAlign w:val="baseline"/>
+          <w:lang w:val="en-US" w:eastAsia="en-US" w:bidi="ar-SA"/>
+        </w:rPr>
+        <w:t xml:space="preserve">Στη συνέχεια προστίθεται πάντα η υποτείνουσα με την συντεταγμένη z του ζητούμενονυ τετραγώνου. </w:t>
+      </w:r>
+    </w:p>
+    <w:p>
+      <w:pPr>
+        <w:pStyle w:val="Normal"/>
+        <w:spacing w:before="0" w:after="200"/>
+        <w:ind w:hanging="0"/>
+        <w:jc w:val="left"/>
+        <w:rPr>
+          <w:rFonts w:ascii="Arial" w:hAnsi="Arial" w:eastAsia="Arial" w:cs="" w:cstheme="minorBidi"/>
+          <w:color w:val="auto"/>
+          <w:kern w:val="0"/>
+          <w:sz w:val="24"/>
+          <w:szCs w:val="22"/>
+          <w:lang w:val="en-US" w:eastAsia="en-US" w:bidi="ar-SA"/>
+        </w:rPr>
+      </w:pPr>
+      <w:r>
+        <w:rPr/>
+      </w:r>
+    </w:p>
+    <w:p>
+      <w:pPr>
+        <w:pStyle w:val="Normal"/>
+        <w:spacing w:before="0" w:after="200"/>
+        <w:ind w:hanging="0"/>
+        <w:jc w:val="left"/>
+        <w:rPr>
+          <w:rFonts w:ascii="Arial" w:hAnsi="Arial" w:eastAsia="Arial" w:cs="" w:cstheme="minorBidi"/>
+          <w:color w:val="auto"/>
+          <w:kern w:val="0"/>
+          <w:sz w:val="24"/>
+          <w:szCs w:val="22"/>
+          <w:lang w:val="en-US" w:eastAsia="en-US" w:bidi="ar-SA"/>
+        </w:rPr>
+      </w:pPr>
+      <w:r>
+        <w:rPr/>
       </w:r>
     </w:p>
     <w:sectPr>

</xml_diff>